<commit_message>
ci: tese unificada build 20260901-235409 (figs auditáveis + main.tex + PDF + docx — braço-B)
</commit_message>
<xml_diff>
--- a/paper_rewriting_output/final_paper/paper.docx
+++ b/paper_rewriting_output/final_paper/paper.docx
@@ -104,70 +104,6 @@
           <w:bCs/>
           <w:b/>
         </w:rPr>
-        <w:t xml:space="preserve">PROGRAMA DE PÓS-GRADUAÇÃO:</w:t>
-      </w:r>
-      <w:r>
-        <w:t xml:space="preserve"> </w:t>
-      </w:r>
-      <w:r>
-        <w:t xml:space="preserve">══════════════════════════════</w:t>
-      </w:r>
-      <w:r>
-        <w:t xml:space="preserve"> </w:t>
-      </w:r>
-      <w:r>
-        <w:rPr>
-          <w:bCs/>
-          <w:b/>
-        </w:rPr>
-        <w:t xml:space="preserve">ÁREA DE CONCENTRAÇÃO:</w:t>
-      </w:r>
-      <w:r>
-        <w:t xml:space="preserve"> </w:t>
-      </w:r>
-      <w:r>
-        <w:t xml:space="preserve">══════════════════════════════</w:t>
-      </w:r>
-      <w:r>
-        <w:t xml:space="preserve"> </w:t>
-      </w:r>
-      <w:r>
-        <w:rPr>
-          <w:bCs/>
-          <w:b/>
-        </w:rPr>
-        <w:t xml:space="preserve">ORIENTADORA:</w:t>
-      </w:r>
-      <w:r>
-        <w:t xml:space="preserve"> </w:t>
-      </w:r>
-      <w:r>
-        <w:t xml:space="preserve">══════════════════════════════</w:t>
-      </w:r>
-      <w:r>
-        <w:t xml:space="preserve"> </w:t>
-      </w:r>
-      <w:r>
-        <w:rPr>
-          <w:bCs/>
-          <w:b/>
-        </w:rPr>
-        <w:t xml:space="preserve">COORIENTADORA:</w:t>
-      </w:r>
-      <w:r>
-        <w:t xml:space="preserve"> </w:t>
-      </w:r>
-      <w:r>
-        <w:t xml:space="preserve">══════════════════════════════</w:t>
-      </w:r>
-      <w:r>
-        <w:t xml:space="preserve"> </w:t>
-      </w:r>
-      <w:r>
-        <w:rPr>
-          <w:bCs/>
-          <w:b/>
-        </w:rPr>
         <w:t xml:space="preserve">DOCUMENTO:</w:t>
       </w:r>
       <w:r>
@@ -2021,7 +1957,7 @@
         <w:pStyle w:val="Heading3"/>
       </w:pPr>
       <w:r>
-        <w:t xml:space="preserve">1.1 Problema</w:t>
+        <w:t xml:space="preserve">2.1 Problema</w:t>
       </w:r>
     </w:p>
     <w:p>
@@ -2065,7 +2001,7 @@
         <w:pStyle w:val="Heading3"/>
       </w:pPr>
       <w:r>
-        <w:t xml:space="preserve">1.2 Justificativa</w:t>
+        <w:t xml:space="preserve">2.2 Justificativa</w:t>
       </w:r>
     </w:p>
     <w:p>
@@ -2138,7 +2074,7 @@
         <w:pStyle w:val="Heading3"/>
       </w:pPr>
       <w:r>
-        <w:t xml:space="preserve">1.3 Questões de pesquisa</w:t>
+        <w:t xml:space="preserve">2.3 Questões de pesquisa</w:t>
       </w:r>
     </w:p>
     <w:p>
@@ -2214,7 +2150,7 @@
         <w:pStyle w:val="Heading3"/>
       </w:pPr>
       <w:r>
-        <w:t xml:space="preserve">1.4 Objetivos</w:t>
+        <w:t xml:space="preserve">2.4 Objetivos</w:t>
       </w:r>
     </w:p>
     <w:p>
@@ -2304,7 +2240,7 @@
         <w:t xml:space="preserve"> </w:t>
       </w:r>
       <w:r>
-        <w:t xml:space="preserve">— Estabelecer a Base de Validade: tríade declarada + linhagem completa dos dados (Cap. 13) [claim:C046] [evidence:E032, E033].</w:t>
+        <w:t xml:space="preserve">— Estabelecer a Base de Validade: tríade declarada + linhagem completa dos dados (Cap. 7) [claim:C046] [evidence:E032, E033].</w:t>
       </w:r>
       <w:r>
         <w:t xml:space="preserve"> </w:t>
@@ -2380,7 +2316,7 @@
         <w:pStyle w:val="Heading3"/>
       </w:pPr>
       <w:r>
-        <w:t xml:space="preserve">1.5 Hipóteses</w:t>
+        <w:t xml:space="preserve">2.5 Hipóteses</w:t>
       </w:r>
     </w:p>
     <w:p>
@@ -2482,7 +2418,7 @@
         <w:pStyle w:val="Heading3"/>
       </w:pPr>
       <w:r>
-        <w:t xml:space="preserve">1.6 Estrutura do documento</w:t>
+        <w:t xml:space="preserve">2.6 Estrutura do documento</w:t>
       </w:r>
     </w:p>
     <w:p>
@@ -2507,7 +2443,7 @@
         <w:pStyle w:val="Heading3"/>
       </w:pPr>
       <w:r>
-        <w:t xml:space="preserve">1.7 Componentes M1–M5 (tabela validada pela autora) e natureza do escopo</w:t>
+        <w:t xml:space="preserve">2.7 Componentes M1–M5 (tabela validada pela autora) e natureza do escopo</w:t>
       </w:r>
     </w:p>
     <w:p>
@@ -3094,7 +3030,7 @@
         <w:pStyle w:val="Heading3"/>
       </w:pPr>
       <w:r>
-        <w:t xml:space="preserve">2.1 Doenças priônicas: o gargalo terapêutico que motiva a continuidade</w:t>
+        <w:t xml:space="preserve">3.1 Doenças priônicas: o gargalo terapêutico que motiva a continuidade</w:t>
       </w:r>
     </w:p>
     <w:p>
@@ -3252,7 +3188,7 @@
         <w:pStyle w:val="Heading3"/>
       </w:pPr>
       <w:r>
-        <w:t xml:space="preserve">2.2 A família dos métodos antecipatórios e os in-silico trials</w:t>
+        <w:t xml:space="preserve">3.2 A família dos métodos antecipatórios e os in-silico trials</w:t>
       </w:r>
     </w:p>
     <w:p>
@@ -3283,7 +3219,7 @@
         <w:pStyle w:val="Heading3"/>
       </w:pPr>
       <w:r>
-        <w:t xml:space="preserve">2.3 Posicionamento da etrização (corroborando H3)</w:t>
+        <w:t xml:space="preserve">3.3 Posicionamento da etrização (corroborando H3)</w:t>
       </w:r>
     </w:p>
     <w:p>
@@ -3359,361 +3295,243 @@
         <w:pStyle w:val="Heading3"/>
       </w:pPr>
       <w:r>
-        <w:t xml:space="preserve">2.4 Fundamento epistemológico</w:t>
-      </w:r>
-    </w:p>
-    <w:p>
-      <w:pPr>
-        <w:pStyle w:val="SourceCode"/>
-      </w:pPr>
-      <w:r>
-        <w:rPr>
-          <w:rStyle w:val="VerbatimChar"/>
-        </w:rPr>
-        <w:t xml:space="preserve">ANALOGIA DO ÁTOMO: COMO UMA PALAVRA FUNDA CIÊNCIA</w:t>
-      </w:r>
-      <w:r>
-        <w:br/>
-      </w:r>
-      <w:r>
-        <w:rPr>
-          <w:rStyle w:val="VerbatimChar"/>
-        </w:rPr>
-        <w:t xml:space="preserve">═════════════════════════════════════════════════</w:t>
-      </w:r>
-      <w:r>
-        <w:br/>
-      </w:r>
-      <w:r>
-        <w:br/>
-      </w:r>
-      <w:r>
-        <w:rPr>
-          <w:rStyle w:val="VerbatimChar"/>
-        </w:rPr>
-        <w:t xml:space="preserve">  Demócrito (~400 a.C.)              │  Esta tese (2026)</w:t>
-      </w:r>
-      <w:r>
-        <w:br/>
-      </w:r>
-      <w:r>
-        <w:rPr>
-          <w:rStyle w:val="VerbatimChar"/>
-        </w:rPr>
-        <w:t xml:space="preserve">  ──────────────────────────         │  ──────────────────────────</w:t>
-      </w:r>
-      <w:r>
-        <w:br/>
-      </w:r>
-      <w:r>
-        <w:rPr>
-          <w:rStyle w:val="VerbatimChar"/>
-        </w:rPr>
-        <w:t xml:space="preserve">  Propôs "átomos" = indivisível      │  Propõe "etrização" = vir-a-ser computacional</w:t>
-      </w:r>
-      <w:r>
-        <w:br/>
-      </w:r>
-      <w:r>
-        <w:rPr>
-          <w:rStyle w:val="VerbatimChar"/>
-        </w:rPr>
-        <w:t xml:space="preserve">  SEM evidência experimental         │  SEM validação laboratorial</w:t>
-      </w:r>
-      <w:r>
-        <w:br/>
-      </w:r>
-      <w:r>
-        <w:rPr>
-          <w:rStyle w:val="VerbatimChar"/>
-        </w:rPr>
-        <w:t xml:space="preserve">  Coerência lógica + poder           │  Coerência matemática + dados reais</w:t>
-      </w:r>
-      <w:r>
-        <w:br/>
-      </w:r>
-      <w:r>
-        <w:rPr>
-          <w:rStyle w:val="VerbatimChar"/>
-        </w:rPr>
-        <w:t xml:space="preserve">  explicativo                        │  publicados</w:t>
-      </w:r>
-      <w:r>
-        <w:br/>
-      </w:r>
-      <w:r>
-        <w:rPr>
-          <w:rStyle w:val="VerbatimChar"/>
-        </w:rPr>
-        <w:t xml:space="preserve">       │                             │       │</w:t>
-      </w:r>
-      <w:r>
-        <w:br/>
-      </w:r>
-      <w:r>
-        <w:rPr>
-          <w:rStyle w:val="VerbatimChar"/>
-        </w:rPr>
-        <w:t xml:space="preserve">       ↓ 2.400 anos                  │       ↓ (começa agora)</w:t>
-      </w:r>
-      <w:r>
-        <w:br/>
-      </w:r>
-      <w:r>
-        <w:rPr>
-          <w:rStyle w:val="VerbatimChar"/>
-        </w:rPr>
-        <w:t xml:space="preserve">       │                             │       │</w:t>
-      </w:r>
-      <w:r>
-        <w:br/>
-      </w:r>
-      <w:r>
-        <w:rPr>
-          <w:rStyle w:val="VerbatimChar"/>
-        </w:rPr>
-        <w:t xml:space="preserve">  Dalton (1803): evidência           │  Dado humano futuro: se análogo,</w:t>
-      </w:r>
-      <w:r>
-        <w:br/>
-      </w:r>
-      <w:r>
-        <w:rPr>
-          <w:rStyle w:val="VerbatimChar"/>
-        </w:rPr>
-        <w:t xml:space="preserve">  Rutherford (1911): modelo          │  antecipação já está BANCADA (P6)</w:t>
-      </w:r>
-      <w:r>
-        <w:br/>
-      </w:r>
-      <w:r>
-        <w:rPr>
-          <w:rStyle w:val="VerbatimChar"/>
-        </w:rPr>
-        <w:t xml:space="preserve">  Bohr (1913): refinamento           │</w:t>
-      </w:r>
-      <w:r>
-        <w:br/>
-      </w:r>
-      <w:r>
-        <w:rPr>
-          <w:rStyle w:val="VerbatimChar"/>
-        </w:rPr>
-        <w:t xml:space="preserve">  Quarks (1964): "indivisível"       │  E se NÃO for análogo?</w:t>
-      </w:r>
-      <w:r>
-        <w:br/>
-      </w:r>
-      <w:r>
-        <w:rPr>
-          <w:rStyle w:val="VerbatimChar"/>
-        </w:rPr>
-        <w:t xml:space="preserve">  estava ERRADO — mas a palavra      │  → recalibra o que informa;</w:t>
-      </w:r>
-      <w:r>
-        <w:br/>
-      </w:r>
-      <w:r>
-        <w:rPr>
-          <w:rStyle w:val="VerbatimChar"/>
-        </w:rPr>
-        <w:t xml:space="preserve">  fundou 2.400 anos de pesquisa      │    predição anterior preservada</w:t>
-      </w:r>
-      <w:r>
-        <w:br/>
-      </w:r>
-      <w:r>
-        <w:rPr>
-          <w:rStyle w:val="VerbatimChar"/>
-        </w:rPr>
-        <w:t xml:space="preserve">  que transformou a civilização      │    como âncora</w:t>
-      </w:r>
-      <w:r>
-        <w:br/>
-      </w:r>
-      <w:r>
-        <w:rPr>
-          <w:rStyle w:val="VerbatimChar"/>
-        </w:rPr>
-        <w:t xml:space="preserve">                                      │</w:t>
-      </w:r>
-      <w:r>
-        <w:br/>
-      </w:r>
-      <w:r>
-        <w:br/>
-      </w:r>
-      <w:r>
-        <w:rPr>
-          <w:rStyle w:val="VerbatimChar"/>
-        </w:rPr>
-        <w:t xml:space="preserve">  → O paralelo não é com o átomo-como-objeto</w:t>
-      </w:r>
-      <w:r>
-        <w:br/>
-      </w:r>
-      <w:r>
-        <w:rPr>
-          <w:rStyle w:val="VerbatimChar"/>
-        </w:rPr>
-        <w:t xml:space="preserve">  → É com o átomo-como-PALAVRA que tornou pesquisável o invisível</w:t>
-      </w:r>
-      <w:r>
-        <w:br/>
-      </w:r>
-      <w:r>
-        <w:rPr>
-          <w:rStyle w:val="VerbatimChar"/>
-        </w:rPr>
-        <w:t xml:space="preserve">  → Etrização torna pesquisável o ainda-não-medido</w:t>
-      </w:r>
-      <w:r>
-        <w:br/>
-      </w:r>
-      <w:r>
-        <w:br/>
-      </w:r>
-      <w:r>
-        <w:rPr>
-          <w:rStyle w:val="VerbatimChar"/>
-        </w:rPr>
-        <w:t xml:space="preserve">  Einstein (1915): Relatividade     │</w:t>
-      </w:r>
-      <w:r>
-        <w:br/>
-      </w:r>
-      <w:r>
-        <w:rPr>
-          <w:rStyle w:val="VerbatimChar"/>
-        </w:rPr>
-        <w:t xml:space="preserve">    Geral predita buracos negros    │</w:t>
-      </w:r>
-      <w:r>
-        <w:br/>
-      </w:r>
-      <w:r>
-        <w:rPr>
-          <w:rStyle w:val="VerbatimChar"/>
-        </w:rPr>
-        <w:t xml:space="preserve">    SEM observação direta           │</w:t>
-      </w:r>
-      <w:r>
-        <w:br/>
-      </w:r>
-      <w:r>
-        <w:rPr>
-          <w:rStyle w:val="VerbatimChar"/>
-        </w:rPr>
-        <w:t xml:space="preserve">    → 2019: primeira foto (EHT)     │</w:t>
-      </w:r>
-      <w:r>
-        <w:br/>
-      </w:r>
-      <w:r>
-        <w:rPr>
-          <w:rStyle w:val="VerbatimChar"/>
-        </w:rPr>
-        <w:t xml:space="preserve">    → 104 anos de predição válida   │</w:t>
-      </w:r>
-      <w:r>
-        <w:br/>
-      </w:r>
-      <w:r>
-        <w:rPr>
-          <w:rStyle w:val="VerbatimChar"/>
-        </w:rPr>
-        <w:t xml:space="preserve">                                     │</w:t>
-      </w:r>
-      <w:r>
-        <w:br/>
-      </w:r>
-      <w:r>
-        <w:rPr>
-          <w:rStyle w:val="VerbatimChar"/>
-        </w:rPr>
-        <w:t xml:space="preserve">  Lemaître (1927): Big Bang        │</w:t>
-      </w:r>
-      <w:r>
-        <w:br/>
-      </w:r>
-      <w:r>
-        <w:rPr>
-          <w:rStyle w:val="VerbatimChar"/>
-        </w:rPr>
-        <w:t xml:space="preserve">    Modelo teórico de dados         │</w:t>
-      </w:r>
-      <w:r>
-        <w:br/>
-      </w:r>
-      <w:r>
-        <w:rPr>
-          <w:rStyle w:val="VerbatimChar"/>
-        </w:rPr>
-        <w:t xml:space="preserve">    indiretos (redshift)            │</w:t>
-      </w:r>
-      <w:r>
-        <w:br/>
-      </w:r>
-      <w:r>
-        <w:rPr>
-          <w:rStyle w:val="VerbatimChar"/>
-        </w:rPr>
-        <w:t xml:space="preserve">    → 1965: CMB confirma            │</w:t>
-      </w:r>
-      <w:r>
-        <w:br/>
-      </w:r>
-      <w:r>
-        <w:rPr>
-          <w:rStyle w:val="VerbatimChar"/>
-        </w:rPr>
-        <w:t xml:space="preserve">    → 38 anos de predição válida    │</w:t>
-      </w:r>
-      <w:r>
-        <w:br/>
-      </w:r>
-      <w:r>
-        <w:rPr>
-          <w:rStyle w:val="VerbatimChar"/>
-        </w:rPr>
-        <w:t xml:space="preserve">                                     │</w:t>
-      </w:r>
-      <w:r>
-        <w:br/>
-      </w:r>
-      <w:r>
-        <w:rPr>
-          <w:rStyle w:val="VerbatimChar"/>
-        </w:rPr>
-        <w:t xml:space="preserve">  → TODAS estas teses foram válidas</w:t>
-      </w:r>
-      <w:r>
-        <w:br/>
-      </w:r>
-      <w:r>
-        <w:rPr>
-          <w:rStyle w:val="VerbatimChar"/>
-        </w:rPr>
-        <w:t xml:space="preserve">  → como TESES, ANTES da confirmação</w:t>
-      </w:r>
-      <w:r>
-        <w:br/>
-      </w:r>
-      <w:r>
-        <w:rPr>
-          <w:rStyle w:val="VerbatimChar"/>
-        </w:rPr>
-        <w:t xml:space="preserve">  → Etrização segue o MESMO padrão</w:t>
-      </w:r>
-    </w:p>
-    <w:p>
-      <w:pPr>
-        <w:pStyle w:val="FirstParagraph"/>
-      </w:pPr>
-      <w:r>
-        <w:t xml:space="preserve">: a etrização como operação ontológica</w:t>
-      </w:r>
-    </w:p>
+        <w:t xml:space="preserve">3.4 Fundamento epistemológico</w:t>
+      </w:r>
+    </w:p>
+    <w:p>
+      <w:pPr>
+        <w:pStyle w:val="TableCaption"/>
+      </w:pPr>
+      <w:r>
+        <w:t xml:space="preserve">a etrização como operação ontológica</w:t>
+      </w:r>
+    </w:p>
+    <w:tbl>
+      <w:tblPr>
+        <w:tblStyle w:val="Table"/>
+        <w:tblW w:type="pct" w:w="5000"/>
+        <w:tblLook w:firstRow="1" w:lastRow="0" w:firstColumn="0" w:lastColumn="0" w:noHBand="0" w:noVBand="0" w:val="0020"/>
+        <w:jc w:val="start"/>
+        <w:tblCaption w:val="a etrização como operação ontológica"/>
+      </w:tblPr>
+      <w:tblGrid>
+        <w:gridCol w:w="3960"/>
+        <w:gridCol w:w="3960"/>
+      </w:tblGrid>
+      <w:tr>
+        <w:trPr>
+          <w:tblHeader w:val="true"/>
+        </w:trPr>
+        <w:tc>
+          <w:tcPr/>
+          <w:p>
+            <w:pPr>
+              <w:pStyle w:val="Compact"/>
+              <w:jc w:val="left"/>
+            </w:pPr>
+            <w:r>
+              <w:t xml:space="preserve">Demócrito (~400 a.C.)</w:t>
+            </w:r>
+          </w:p>
+        </w:tc>
+        <w:tc>
+          <w:tcPr/>
+          <w:p>
+            <w:pPr>
+              <w:pStyle w:val="Compact"/>
+              <w:jc w:val="left"/>
+            </w:pPr>
+            <w:r>
+              <w:t xml:space="preserve">Esta tese (2026)</w:t>
+            </w:r>
+          </w:p>
+        </w:tc>
+      </w:tr>
+      <w:tr>
+        <w:tc>
+          <w:tcPr/>
+          <w:p>
+            <w:pPr>
+              <w:pStyle w:val="Compact"/>
+              <w:jc w:val="left"/>
+            </w:pPr>
+            <w:r>
+              <w:t xml:space="preserve">Propôs</w:t>
+            </w:r>
+            <w:r>
+              <w:t xml:space="preserve"> </w:t>
+            </w:r>
+            <w:r>
+              <w:t xml:space="preserve">“</w:t>
+            </w:r>
+            <w:r>
+              <w:t xml:space="preserve">átomos</w:t>
+            </w:r>
+            <w:r>
+              <w:t xml:space="preserve">”</w:t>
+            </w:r>
+            <w:r>
+              <w:t xml:space="preserve"> </w:t>
+            </w:r>
+            <w:r>
+              <w:t xml:space="preserve">= indivisível</w:t>
+            </w:r>
+          </w:p>
+        </w:tc>
+        <w:tc>
+          <w:tcPr/>
+          <w:p>
+            <w:pPr>
+              <w:pStyle w:val="Compact"/>
+              <w:jc w:val="left"/>
+            </w:pPr>
+            <w:r>
+              <w:t xml:space="preserve">Propõe</w:t>
+            </w:r>
+            <w:r>
+              <w:t xml:space="preserve"> </w:t>
+            </w:r>
+            <w:r>
+              <w:t xml:space="preserve">“</w:t>
+            </w:r>
+            <w:r>
+              <w:t xml:space="preserve">etrização</w:t>
+            </w:r>
+            <w:r>
+              <w:t xml:space="preserve">”</w:t>
+            </w:r>
+            <w:r>
+              <w:t xml:space="preserve"> </w:t>
+            </w:r>
+            <w:r>
+              <w:t xml:space="preserve">= vir-a-ser computacional</w:t>
+            </w:r>
+          </w:p>
+        </w:tc>
+      </w:tr>
+      <w:tr>
+        <w:tc>
+          <w:tcPr/>
+          <w:p>
+            <w:pPr>
+              <w:pStyle w:val="Compact"/>
+              <w:jc w:val="left"/>
+            </w:pPr>
+            <w:r>
+              <w:t xml:space="preserve">SEM evidência experimental</w:t>
+            </w:r>
+          </w:p>
+        </w:tc>
+        <w:tc>
+          <w:tcPr/>
+          <w:p>
+            <w:pPr>
+              <w:pStyle w:val="Compact"/>
+              <w:jc w:val="left"/>
+            </w:pPr>
+            <w:r>
+              <w:t xml:space="preserve">SEM validação laboratorial</w:t>
+            </w:r>
+          </w:p>
+        </w:tc>
+      </w:tr>
+      <w:tr>
+        <w:tc>
+          <w:tcPr/>
+          <w:p>
+            <w:pPr>
+              <w:pStyle w:val="Compact"/>
+              <w:jc w:val="left"/>
+            </w:pPr>
+            <w:r>
+              <w:t xml:space="preserve">Coerência lógica + poder explicativo</w:t>
+            </w:r>
+          </w:p>
+        </w:tc>
+        <w:tc>
+          <w:tcPr/>
+          <w:p>
+            <w:pPr>
+              <w:pStyle w:val="Compact"/>
+              <w:jc w:val="left"/>
+            </w:pPr>
+            <w:r>
+              <w:t xml:space="preserve">Coerência matemática + dados reais publicados</w:t>
+            </w:r>
+          </w:p>
+        </w:tc>
+      </w:tr>
+      <w:tr>
+        <w:tc>
+          <w:tcPr/>
+          <w:p>
+            <w:pPr>
+              <w:pStyle w:val="Compact"/>
+              <w:jc w:val="left"/>
+            </w:pPr>
+            <w:r>
+              <w:t xml:space="preserve">↓ 2.400 anos</w:t>
+            </w:r>
+          </w:p>
+        </w:tc>
+        <w:tc>
+          <w:tcPr/>
+          <w:p>
+            <w:pPr>
+              <w:pStyle w:val="Compact"/>
+              <w:jc w:val="left"/>
+            </w:pPr>
+            <w:r>
+              <w:t xml:space="preserve">↓ (começa agora)</w:t>
+            </w:r>
+          </w:p>
+        </w:tc>
+      </w:tr>
+      <w:tr>
+        <w:tc>
+          <w:tcPr/>
+          <w:p>
+            <w:pPr>
+              <w:pStyle w:val="Compact"/>
+              <w:jc w:val="left"/>
+            </w:pPr>
+            <w:r>
+              <w:t xml:space="preserve">Dalton (1803): evidência · Rutherford (1911): modelo · Bohr (1913): refinamento · Quarks (1964):</w:t>
+            </w:r>
+            <w:r>
+              <w:t xml:space="preserve"> </w:t>
+            </w:r>
+            <w:r>
+              <w:t xml:space="preserve">“</w:t>
+            </w:r>
+            <w:r>
+              <w:t xml:space="preserve">indivisível</w:t>
+            </w:r>
+            <w:r>
+              <w:t xml:space="preserve">”</w:t>
+            </w:r>
+            <w:r>
+              <w:t xml:space="preserve"> </w:t>
+            </w:r>
+            <w:r>
+              <w:t xml:space="preserve">estava ERRADO — mas a palavra fundou 2.400 anos de pesquisa que transformou a civilização</w:t>
+            </w:r>
+          </w:p>
+        </w:tc>
+        <w:tc>
+          <w:tcPr/>
+          <w:p>
+            <w:pPr>
+              <w:pStyle w:val="Compact"/>
+              <w:jc w:val="left"/>
+            </w:pPr>
+            <w:r>
+              <w:t xml:space="preserve">Dado humano futuro: se análogo, antecipação já está BANCADA (P6). E se NÃO for análogo? → recalibra o que informa; predição anterior preservada como âncora</w:t>
+            </w:r>
+          </w:p>
+        </w:tc>
+      </w:tr>
+    </w:tbl>
     <w:p>
       <w:pPr>
         <w:pStyle w:val="BodyText"/>
@@ -3900,7 +3718,7 @@
         <w:t xml:space="preserve"> </w:t>
       </w:r>
       <w:r>
-        <w:t xml:space="preserve">— e ao legitimá-lo com critérios (5 requisitos da §3.1), o disciplinariza.</w:t>
+        <w:t xml:space="preserve">— e ao legitimá-lo com critérios (5 requisitos da §5.1), o disciplinariza.</w:t>
       </w:r>
     </w:p>
     <w:p>
@@ -3954,7 +3772,7 @@
         <w:pStyle w:val="Heading3"/>
       </w:pPr>
       <w:r>
-        <w:t xml:space="preserve">2.5 Síntese</w:t>
+        <w:t xml:space="preserve">3.5 Síntese</w:t>
       </w:r>
     </w:p>
     <w:p>
@@ -4008,7 +3826,7 @@
         <w:pStyle w:val="Heading2"/>
       </w:pPr>
       <w:r>
-        <w:t xml:space="preserve">2.1 A mesma base sob os dois módulos</w:t>
+        <w:t xml:space="preserve">4.1 A mesma base sob os dois módulos</w:t>
       </w:r>
     </w:p>
     <w:p>
@@ -4096,7 +3914,7 @@
         <w:t xml:space="preserve"> </w:t>
       </w:r>
       <w:r>
-        <w:t xml:space="preserve">(P04156 e ortólogos; matriz BLOSUM62; P023) — das quais se computou a massa molecular usada na dose (22,83 kDa [claim:N060-fato] [evidence:E058]).</w:t>
+        <w:t xml:space="preserve">(P04156 e ortólogos; matriz BLOSUM62; P023) — das quais se computou a massa molecular usada na dose (22,83 kDa [evidence:E058]).</w:t>
       </w:r>
     </w:p>
     <w:bookmarkEnd w:id="44"/>
@@ -4106,7 +3924,7 @@
         <w:pStyle w:val="Heading2"/>
       </w:pPr>
       <w:r>
-        <w:t xml:space="preserve">2.2 Cronologia honesta (o examinador hostil perguntaria — respondemos antes)</w:t>
+        <w:t xml:space="preserve">4.2 Cronologia honesta (o examinador hostil perguntaria — respondemos antes)</w:t>
       </w:r>
     </w:p>
     <w:p>
@@ -4269,7 +4087,7 @@
         <w:pStyle w:val="Heading2"/>
       </w:pPr>
       <w:r>
-        <w:t xml:space="preserve">2.3 Tabela de validação (todos os números dos JSONs do registro)</w:t>
+        <w:t xml:space="preserve">4.3 Tabela de validação (todos os números dos JSONs do registro)</w:t>
       </w:r>
     </w:p>
     <w:tbl>
@@ -4475,7 +4293,7 @@
               <w:jc w:val="left"/>
             </w:pPr>
             <w:r>
-              <w:t xml:space="preserve">✅ contém até Kt≈2 (ressalva de horizonte, §3.4)</w:t>
+              <w:t xml:space="preserve">✅ contém até Kt≈2 (ressalva de horizonte, §5.4)</w:t>
             </w:r>
           </w:p>
         </w:tc>
@@ -4725,7 +4543,7 @@
         <w:pStyle w:val="Heading2"/>
       </w:pPr>
       <w:r>
-        <w:t xml:space="preserve">3.1 Do sweep de composição à parametrização por espécie</w:t>
+        <w:t xml:space="preserve">5.1 Do sweep de composição à parametrização por espécie</w:t>
       </w:r>
     </w:p>
     <w:p>
@@ -4759,7 +4577,7 @@
         <w:pStyle w:val="Heading2"/>
       </w:pPr>
       <w:r>
-        <w:t xml:space="preserve">3.2 Cenário B [SIM]</w:t>
+        <w:t xml:space="preserve">5.2 Cenário B [SIM]</w:t>
       </w:r>
     </w:p>
     <w:p>
@@ -4806,7 +4624,7 @@
         <w:pStyle w:val="Heading2"/>
       </w:pPr>
       <w:r>
-        <w:t xml:space="preserve">3.3 Regra de titulação emergente</w:t>
+        <w:t xml:space="preserve">5.3 Regra de titulação emergente</w:t>
       </w:r>
     </w:p>
     <w:p>
@@ -4853,7 +4671,7 @@
         <w:pStyle w:val="Heading2"/>
       </w:pPr>
       <w:r>
-        <w:t xml:space="preserve">3.4 Dependência de horizonte (a única assimetria real)</w:t>
+        <w:t xml:space="preserve">5.4 Dependência de horizonte (a única assimetria real)</w:t>
       </w:r>
     </w:p>
     <w:p>
@@ -5074,7 +4892,7 @@
         <w:pStyle w:val="Heading2"/>
       </w:pPr>
       <w:r>
-        <w:t xml:space="preserve">4.1 Transporte: três regras falseáveis [SIM]</w:t>
+        <w:t xml:space="preserve">6.1 Transporte: três regras falseáveis [SIM]</w:t>
       </w:r>
     </w:p>
     <w:p>
@@ -5181,7 +4999,7 @@
         <w:pStyle w:val="Heading2"/>
       </w:pPr>
       <w:r>
-        <w:t xml:space="preserve">4.2 O limiar travado e a dose legitimada pela banda</w:t>
+        <w:t xml:space="preserve">6.2 O limiar travado e a dose legitimada pela banda</w:t>
       </w:r>
     </w:p>
     <w:p>
@@ -5221,7 +5039,7 @@
         <w:t xml:space="preserve"> </w:t>
       </w:r>
       <w:r>
-        <w:t xml:space="preserve">(κ_min=2,0 em Kt=2) e a estendeu além dela pela regra de titulação κ_req↔Kt [claim:C057] [evidence:E032] — com a ressalva de horizonte sempre citada (§3.4) [claim:C056] [evidence:E032].</w:t>
+        <w:t xml:space="preserve">(κ_min=2,0 em Kt=2) e a estendeu além dela pela regra de titulação κ_req↔Kt [claim:C057] [evidence:E032] — com a ressalva de horizonte sempre citada (§5.4) [claim:C056] [evidence:E032].</w:t>
       </w:r>
     </w:p>
     <w:p>
@@ -5271,7 +5089,7 @@
         <w:pStyle w:val="Heading2"/>
       </w:pPr>
       <w:r>
-        <w:t xml:space="preserve">4.3 A primeira dose calculada: banda de dose do braço A6 [SIM-planejamento]</w:t>
+        <w:t xml:space="preserve">6.3 A primeira dose calculada: banda de dose do braço A6 [SIM-planejamento]</w:t>
       </w:r>
     </w:p>
     <w:p>
@@ -5305,7 +5123,14 @@
           <w:bCs/>
           <w:b/>
         </w:rPr>
-        <w:t xml:space="preserve">):</w:t>
+        <w:t xml:space="preserve"> </w:t>
+      </w:r>
+      <w:r>
+        <w:rPr>
+          <w:bCs/>
+          <w:b/>
+        </w:rPr>
+        <w:t xml:space="preserve">[58]):</w:t>
       </w:r>
       <w:r>
         <w:t xml:space="preserve"> </w:t>
@@ -5334,7 +5159,7 @@
         <w:t xml:space="preserve">(illustrative assumption; closed by arm A6)</w:t>
       </w:r>
       <w:r>
-        <w:t xml:space="preserve">: o piso, 71 nM, é o Kd medido por SPR para oligômeros de Aβ42 ligando PrP humano —</w:t>
+        <w:t xml:space="preserve">: o piso, 71 nM, é o Kd medido por SPR para oligômeros de Aβ42 ligando PrP humano [57] —</w:t>
       </w:r>
       <w:r>
         <w:t xml:space="preserve"> </w:t>
@@ -6008,7 +5833,7 @@
         <w:pStyle w:val="Heading2"/>
       </w:pPr>
       <w:r>
-        <w:t xml:space="preserve">4.4 O ensaio que fecha a banda: G0-wet especificado</w:t>
+        <w:t xml:space="preserve">6.4 O ensaio que fecha a banda: G0-wet especificado</w:t>
       </w:r>
     </w:p>
     <w:p>
@@ -6042,7 +5867,7 @@
         <w:pStyle w:val="Heading2"/>
       </w:pPr>
       <w:r>
-        <w:t xml:space="preserve">4.5 Custo-cotação</w:t>
+        <w:t xml:space="preserve">6.5 Custo-cotação</w:t>
       </w:r>
     </w:p>
     <w:p>
@@ -6062,7 +5887,7 @@
     </w:p>
     <w:bookmarkEnd w:id="57"/>
     <w:bookmarkEnd w:id="58"/>
-    <w:bookmarkStart w:id="63" w:name="Xe228acfd09a157cad16ef245a7918c5b059d66a"/>
+    <w:bookmarkStart w:id="64" w:name="Xe228acfd09a157cad16ef245a7918c5b059d66a"/>
     <w:p>
       <w:pPr>
         <w:pStyle w:val="Heading1"/>
@@ -6071,13 +5896,159 @@
         <w:t xml:space="preserve">CAPÍTULO 7 — MÉTODOS: A ETRIZAÇÃO FORMALIZADA</w:t>
       </w:r>
     </w:p>
-    <w:bookmarkStart w:id="59" w:name="X8b6dc00826d26841001b04930f734d2564b5f6f"/>
+    <w:bookmarkStart w:id="59" w:name="pipeline-do-método-p0p6"/>
+    <w:p>
+      <w:pPr>
+        <w:pStyle w:val="Heading3"/>
+      </w:pPr>
+      <w:r>
+        <w:t xml:space="preserve">7.0 Pipeline do método (P0–P6)</w:t>
+      </w:r>
+    </w:p>
+    <w:p>
+      <w:pPr>
+        <w:pStyle w:val="FirstParagraph"/>
+      </w:pPr>
+      <w:r>
+        <w:rPr>
+          <w:bCs/>
+          <w:b/>
+        </w:rPr>
+        <w:t xml:space="preserve">Fluxo:</w:t>
+      </w:r>
+      <w:r>
+        <w:t xml:space="preserve"> </w:t>
+      </w:r>
+      <w:r>
+        <w:rPr>
+          <w:bCs/>
+          <w:b/>
+        </w:rPr>
+        <w:t xml:space="preserve">P0</w:t>
+      </w:r>
+      <w:r>
+        <w:t xml:space="preserve"> </w:t>
+      </w:r>
+      <w:r>
+        <w:t xml:space="preserve">identificação (SLR auditada → base E-registrada com linhagem) →</w:t>
+      </w:r>
+      <w:r>
+        <w:t xml:space="preserve"> </w:t>
+      </w:r>
+      <w:r>
+        <w:rPr>
+          <w:bCs/>
+          <w:b/>
+        </w:rPr>
+        <w:t xml:space="preserve">P1</w:t>
+      </w:r>
+      <w:r>
+        <w:t xml:space="preserve"> </w:t>
+      </w:r>
+      <w:r>
+        <w:t xml:space="preserve">parametrização (derivação com proveniência por parâmetro) →</w:t>
+      </w:r>
+      <w:r>
+        <w:t xml:space="preserve"> </w:t>
+      </w:r>
+      <w:r>
+        <w:rPr>
+          <w:bCs/>
+          <w:b/>
+        </w:rPr>
+        <w:t xml:space="preserve">P2</w:t>
+      </w:r>
+      <w:r>
+        <w:t xml:space="preserve"> </w:t>
+      </w:r>
+      <w:r>
+        <w:t xml:space="preserve">execução (motores determinísticos auto-testados → runs arquivados [SIM]) →</w:t>
+      </w:r>
+      <w:r>
+        <w:t xml:space="preserve"> </w:t>
+      </w:r>
+      <w:r>
+        <w:rPr>
+          <w:bCs/>
+          <w:b/>
+        </w:rPr>
+        <w:t xml:space="preserve">P3</w:t>
+      </w:r>
+      <w:r>
+        <w:t xml:space="preserve"> </w:t>
+      </w:r>
+      <w:r>
+        <w:t xml:space="preserve">colheita (critérios pré-declarados → veredito sem meta móvel) →</w:t>
+      </w:r>
+      <w:r>
+        <w:t xml:space="preserve"> </w:t>
+      </w:r>
+      <w:r>
+        <w:rPr>
+          <w:bCs/>
+          <w:b/>
+        </w:rPr>
+        <w:t xml:space="preserve">P4</w:t>
+      </w:r>
+      <w:r>
+        <w:t xml:space="preserve"> </w:t>
+      </w:r>
+      <w:r>
+        <w:t xml:space="preserve">prognóstico (predições travadas por release ANTES da medição → âncora anti-hindsight) →</w:t>
+      </w:r>
+      <w:r>
+        <w:t xml:space="preserve"> </w:t>
+      </w:r>
+      <w:r>
+        <w:rPr>
+          <w:bCs/>
+          <w:b/>
+        </w:rPr>
+        <w:t xml:space="preserve">P5</w:t>
+      </w:r>
+      <w:r>
+        <w:t xml:space="preserve"> </w:t>
+      </w:r>
+      <w:r>
+        <w:t xml:space="preserve">pesquisa derivada (novas perguntas prosseguem imediatamente) →</w:t>
+      </w:r>
+      <w:r>
+        <w:t xml:space="preserve"> </w:t>
+      </w:r>
+      <w:r>
+        <w:rPr>
+          <w:bCs/>
+          <w:b/>
+        </w:rPr>
+        <w:t xml:space="preserve">P6</w:t>
+      </w:r>
+      <w:r>
+        <w:t xml:space="preserve"> </w:t>
+      </w:r>
+      <w:r>
+        <w:t xml:space="preserve">confronto opcional (dado real análogo ⇒ antecipação bancada).</w:t>
+      </w:r>
+    </w:p>
+    <w:p>
+      <w:pPr>
+        <w:pStyle w:val="BodyText"/>
+      </w:pPr>
+      <w:r>
+        <w:rPr>
+          <w:iCs/>
+          <w:i/>
+        </w:rPr>
+        <w:t xml:space="preserve">Tabela completa com entradas/saídas/garantias por passo: §7.1.</w:t>
+      </w:r>
+    </w:p>
+    <w:bookmarkEnd w:id="59"/>
+    <w:bookmarkStart w:id="60" w:name="X8b6dc00826d26841001b04930f734d2564b5f6f"/>
     <w:p>
       <w:pPr>
         <w:pStyle w:val="Heading2"/>
       </w:pPr>
       <w:r>
-        <w:t xml:space="preserve">5.1 O método nomeado: etrização computacional, passos P0–P6</w:t>
+        <w:t xml:space="preserve">7.1 O método nomeado: etrização computacional, passos P0–P6</w:t>
       </w:r>
     </w:p>
     <w:p>
@@ -6804,14 +6775,14 @@
         <w:t xml:space="preserve">(tiers [SIM]/[ORGANOID]/[MOUSE]/[HUMAN] [claim:C047] [evidence:E032, E033]).</w:t>
       </w:r>
     </w:p>
-    <w:bookmarkEnd w:id="59"/>
-    <w:bookmarkStart w:id="60" w:name="formulação-matemática-com-proveniência"/>
+    <w:bookmarkEnd w:id="60"/>
+    <w:bookmarkStart w:id="61" w:name="formulação-matemática-com-proveniência"/>
     <w:p>
       <w:pPr>
         <w:pStyle w:val="Heading2"/>
       </w:pPr>
       <w:r>
-        <w:t xml:space="preserve">5.2 Formulação matemática com proveniência</w:t>
+        <w:t xml:space="preserve">7.2 Formulação matemática com proveniência</w:t>
       </w:r>
     </w:p>
     <w:p>
@@ -7541,14 +7512,14 @@
         <w:t xml:space="preserve">: features (raio R, log-razão de biomassa); κ̂ vizinho-mais-próximo na grade κ∈{1,5–8}; θ̂=1/(1+κ̂); regime por braço (mediana, n=8, IC bootstrap 90%). Veredito pré-declarado: ADEQUADO na fronteira de decisão (cobertura 3/3; bias −0,008 em κ=2); v1.1 interpolada testada e rejeitada [claim:C052] [evidence:E032, E033].</w:t>
       </w:r>
     </w:p>
-    <w:bookmarkEnd w:id="60"/>
-    <w:bookmarkStart w:id="61" w:name="base-de-validade-mandatória"/>
+    <w:bookmarkEnd w:id="61"/>
+    <w:bookmarkStart w:id="62" w:name="base-de-validade-mandatória"/>
     <w:p>
       <w:pPr>
         <w:pStyle w:val="Heading2"/>
       </w:pPr>
       <w:r>
-        <w:t xml:space="preserve">5.3 Base de Validade (MANDATÓRIA)</w:t>
+        <w:t xml:space="preserve">7.3 Base de Validade (MANDATÓRIA)</w:t>
       </w:r>
     </w:p>
     <w:p>
@@ -8068,7 +8039,7 @@
               <w:jc w:val="left"/>
             </w:pPr>
             <w:r>
-              <w:t xml:space="preserve">Chen 2010 SPR [E057] + âncora ilustrativa P1 §2.2</w:t>
+              <w:t xml:space="preserve">Chen 2010 SPR [E057] + âncora ilustrativa P1 §4.2</w:t>
             </w:r>
           </w:p>
         </w:tc>
@@ -8352,14 +8323,14 @@
         <w:t xml:space="preserve">experimental exige.</w:t>
       </w:r>
     </w:p>
-    <w:bookmarkEnd w:id="61"/>
-    <w:bookmarkStart w:id="62" w:name="X54aab480f746b6a3f845896e727d77258ddb482"/>
+    <w:bookmarkEnd w:id="62"/>
+    <w:bookmarkStart w:id="63" w:name="X54aab480f746b6a3f845896e727d77258ddb482"/>
     <w:p>
       <w:pPr>
         <w:pStyle w:val="Heading2"/>
       </w:pPr>
       <w:r>
-        <w:t xml:space="preserve">5.4 A tese em forma experimental (mapeamento análogo)</w:t>
+        <w:t xml:space="preserve">7.4 A tese em forma experimental (mapeamento análogo)</w:t>
       </w:r>
     </w:p>
     <w:tbl>
@@ -8884,9 +8855,9 @@
         </w:pict>
       </w:r>
     </w:p>
-    <w:bookmarkEnd w:id="62"/>
     <w:bookmarkEnd w:id="63"/>
-    <w:bookmarkStart w:id="70" w:name="X9c5b75166a5d9518fbe2cee6a57dd88a5fdc544"/>
+    <w:bookmarkEnd w:id="64"/>
+    <w:bookmarkStart w:id="71" w:name="X9c5b75166a5d9518fbe2cee6a57dd88a5fdc544"/>
     <w:p>
       <w:pPr>
         <w:pStyle w:val="Heading1"/>
@@ -9265,7 +9236,7 @@
         </w:tc>
       </w:tr>
     </w:tbl>
-    <w:bookmarkStart w:id="64" w:name="X7141ca12e723a08dcf01fe4ddee85cbc3921d75"/>
+    <w:bookmarkStart w:id="65" w:name="X7141ca12e723a08dcf01fe4ddee85cbc3921d75"/>
     <w:p>
       <w:pPr>
         <w:pStyle w:val="Heading3"/>
@@ -9382,7 +9353,7 @@
         <w:t xml:space="preserve">experiments/part2_results/part2_derived_summary.json</w:t>
       </w:r>
       <w:r>
-        <w:t xml:space="preserve">; §4.1) [claim:C052] [evidence:E032, E033].</w:t>
+        <w:t xml:space="preserve">; §6.1) [claim:C052] [evidence:E032, E033].</w:t>
       </w:r>
     </w:p>
     <w:p>
@@ -9500,8 +9471,8 @@
         <w:t xml:space="preserve">— portas abertas.</w:t>
       </w:r>
     </w:p>
-    <w:bookmarkEnd w:id="64"/>
-    <w:bookmarkStart w:id="65" w:name="Xb7aeddc59776181d66990e203de599e5530748c"/>
+    <w:bookmarkEnd w:id="65"/>
+    <w:bookmarkStart w:id="66" w:name="Xb7aeddc59776181d66990e203de599e5530748c"/>
     <w:p>
       <w:pPr>
         <w:pStyle w:val="Heading3"/>
@@ -9670,8 +9641,8 @@
         <w:t xml:space="preserve">Achado de design que o método produziu: a razão de biomassa carrega a informação que o raio perde por saturação (R 0,843→0,760 mm contra razão 48→1,25 na grade) — o estimador opera no par de features por necessidade [claim:C052] [evidence:E032, E033].</w:t>
       </w:r>
     </w:p>
-    <w:bookmarkEnd w:id="65"/>
-    <w:bookmarkStart w:id="66" w:name="X85f1aa5e6c8eb7ecdbf6d0390cfee212383dc30"/>
+    <w:bookmarkEnd w:id="66"/>
+    <w:bookmarkStart w:id="67" w:name="X85f1aa5e6c8eb7ecdbf6d0390cfee212383dc30"/>
     <w:p>
       <w:pPr>
         <w:pStyle w:val="Heading3"/>
@@ -9701,8 +9672,8 @@
         <w:t xml:space="preserve">, esquema de dado [ORGANOID] (contrato bancada→estimador; exclusões publicadas nunca editadas), loop M3, timelines (readouts 90–120 d; regime estacionário desde ~4 d) e M4 (parceiro por método). Regra: pós-GATE-F, qualquer mudança é emenda auditada com re-análise com-e-sem.</w:t>
       </w:r>
     </w:p>
-    <w:bookmarkEnd w:id="66"/>
-    <w:bookmarkStart w:id="67" w:name="Xe3155c5e67877c615421a63d47ed6cd47a5eb9f"/>
+    <w:bookmarkEnd w:id="67"/>
+    <w:bookmarkStart w:id="68" w:name="Xe3155c5e67877c615421a63d47ed6cd47a5eb9f"/>
     <w:p>
       <w:pPr>
         <w:pStyle w:val="Heading3"/>
@@ -9779,8 +9750,8 @@
         <w:t xml:space="preserve">sem ter previsto antes.</w:t>
       </w:r>
     </w:p>
-    <w:bookmarkEnd w:id="67"/>
-    <w:bookmarkStart w:id="68" w:name="X555a26d4421973e92e06b31777049305a67077c"/>
+    <w:bookmarkEnd w:id="68"/>
+    <w:bookmarkStart w:id="69" w:name="X555a26d4421973e92e06b31777049305a67077c"/>
     <w:p>
       <w:pPr>
         <w:pStyle w:val="Heading3"/>
@@ -9986,8 +9957,8 @@
         <w:t xml:space="preserve">Replicabilidade posterior: qualquer pesquisador re-executa as strings, re-tria, re-pontua; divergências &gt;10 pts viram auditoria, não erro. Viés declarado: single-rater v1 (co-rating pré-declarado como pendência).</w:t>
       </w:r>
     </w:p>
-    <w:bookmarkEnd w:id="68"/>
-    <w:bookmarkStart w:id="69" w:name="X9b4d9a558c1cc392c3c00d2f61c042c51c570ef"/>
+    <w:bookmarkEnd w:id="69"/>
+    <w:bookmarkStart w:id="70" w:name="X9b4d9a558c1cc392c3c00d2f61c042c51c570ef"/>
     <w:p>
       <w:pPr>
         <w:pStyle w:val="Heading3"/>
@@ -10052,9 +10023,9 @@
         </w:pict>
       </w:r>
     </w:p>
-    <w:bookmarkEnd w:id="69"/>
     <w:bookmarkEnd w:id="70"/>
-    <w:bookmarkStart w:id="76" w:name="Xee3c0e2adf2e9dfa4d03efde2b2006be11c554f"/>
+    <w:bookmarkEnd w:id="71"/>
+    <w:bookmarkStart w:id="77" w:name="Xee3c0e2adf2e9dfa4d03efde2b2006be11c554f"/>
     <w:p>
       <w:pPr>
         <w:pStyle w:val="Heading1"/>
@@ -10086,13 +10057,13 @@
         <w:t xml:space="preserve">: consolida os achados, mapeia os impactos em camadas, identifica as áreas correlatas onde o mesmo método é aplicável, e declara — mandatoriamente — o que vem a seguir.</w:t>
       </w:r>
     </w:p>
-    <w:bookmarkStart w:id="71" w:name="achados-e-impactos"/>
+    <w:bookmarkStart w:id="72" w:name="achados-e-impactos"/>
     <w:p>
       <w:pPr>
         <w:pStyle w:val="Heading3"/>
       </w:pPr>
       <w:r>
-        <w:t xml:space="preserve">5.1 Achados e impactos</w:t>
+        <w:t xml:space="preserve">9.1 Achados e impactos</w:t>
       </w:r>
     </w:p>
     <w:p>
@@ -10208,8 +10179,8 @@
         <w:t xml:space="preserve">) [claim:C054] [evidence:E009, E010, E031, E032, E033, E007].</w:t>
       </w:r>
     </w:p>
-    <w:bookmarkEnd w:id="71"/>
-    <w:bookmarkStart w:id="72" w:name="X1e0bea7ede5d3d883c22bfe0daaf10adf47bf24"/>
+    <w:bookmarkEnd w:id="72"/>
+    <w:bookmarkStart w:id="73" w:name="X1e0bea7ede5d3d883c22bfe0daaf10adf47bf24"/>
     <w:p>
       <w:pPr>
         <w:pStyle w:val="Heading3"/>
@@ -10334,14 +10305,14 @@
         <w:t xml:space="preserve">apesar do potencial demonstrado — faz-se necessário, para uso humano, o teste e a validação com dados experimentais da Parte 1 (pré-tese) executados em laboratório. A tese entrega o prognóstico; a aplicação exige o G0-wet.</w:t>
       </w:r>
     </w:p>
-    <w:bookmarkEnd w:id="72"/>
-    <w:bookmarkStart w:id="73" w:name="áreas-correlatas-com-a-mesma-usabilidade"/>
+    <w:bookmarkEnd w:id="73"/>
+    <w:bookmarkStart w:id="74" w:name="áreas-correlatas-com-a-mesma-usabilidade"/>
     <w:p>
       <w:pPr>
         <w:pStyle w:val="Heading3"/>
       </w:pPr>
       <w:r>
-        <w:t xml:space="preserve">5.2 Áreas correlatas com a mesma usabilidade</w:t>
+        <w:t xml:space="preserve">9.2 Áreas correlatas com a mesma usabilidade</w:t>
       </w:r>
     </w:p>
     <w:p>
@@ -10368,8 +10339,8 @@
         <w:t xml:space="preserve">antes de gastar recurso — a função-objetivo da própria etrização.</w:t>
       </w:r>
     </w:p>
-    <w:bookmarkEnd w:id="73"/>
-    <w:bookmarkStart w:id="74" w:name="Xd1a98d48acaf035f637ff4dc6ba8547a62341b4"/>
+    <w:bookmarkEnd w:id="74"/>
+    <w:bookmarkStart w:id="75" w:name="Xd1a98d48acaf035f637ff4dc6ba8547a62341b4"/>
     <w:p>
       <w:pPr>
         <w:pStyle w:val="Heading3"/>
@@ -10500,14 +10471,14 @@
         <w:t xml:space="preserve">: para Aβ/α-synucleína, NÃO existe variante protetora natural selecionada pela evolução (como o V127 do kuru). O agente terapêutico teria de ser engenheirado (anticorpo, variante travada, degradação direcionada) — uma incerteza adicional de existência, não apenas de engenharia. O cálculo (P0-P5) transfere; o agente, não.</w:t>
       </w:r>
     </w:p>
-    <w:bookmarkEnd w:id="74"/>
-    <w:bookmarkStart w:id="75" w:name="Xc0da7e41f3087777992b2f87ded60efae136cee"/>
+    <w:bookmarkEnd w:id="75"/>
+    <w:bookmarkStart w:id="76" w:name="Xc0da7e41f3087777992b2f87ded60efae136cee"/>
     <w:p>
       <w:pPr>
         <w:pStyle w:val="Heading3"/>
       </w:pPr>
       <w:r>
-        <w:t xml:space="preserve">5.3 Próximas abordagens (declaração mandatória conforme metodologia)</w:t>
+        <w:t xml:space="preserve">9.3 Próximas abordagens (declaração mandatória conforme metodologia)</w:t>
       </w:r>
     </w:p>
     <w:p>
@@ -10610,9 +10581,9 @@
         </w:pict>
       </w:r>
     </w:p>
-    <w:bookmarkEnd w:id="75"/>
     <w:bookmarkEnd w:id="76"/>
-    <w:bookmarkStart w:id="79" w:name="capítulo-10-discussão"/>
+    <w:bookmarkEnd w:id="77"/>
+    <w:bookmarkStart w:id="80" w:name="capítulo-10-discussão"/>
     <w:p>
       <w:pPr>
         <w:pStyle w:val="Heading1"/>
@@ -10629,13 +10600,13 @@
         <w:t xml:space="preserve">Este capítulo pesa os resultados: o que significam, o que não significam, e como se posicionam entre a promessa e o limite.</w:t>
       </w:r>
     </w:p>
-    <w:bookmarkStart w:id="77" w:name="promessas-e-limites-desta-parte-2"/>
+    <w:bookmarkStart w:id="78" w:name="promessas-e-limites-desta-parte-2"/>
     <w:p>
       <w:pPr>
         <w:pStyle w:val="Heading3"/>
       </w:pPr>
       <w:r>
-        <w:t xml:space="preserve">6.1 Promessas e limites desta Parte 2</w:t>
+        <w:t xml:space="preserve">10.1 Promessas e limites desta Parte 2</w:t>
       </w:r>
     </w:p>
     <w:p>
@@ -10688,14 +10659,14 @@
         <w:t xml:space="preserve">: seleção de parceiro (execução externa), dado [ORGANOID]+ (não existe ainda — e é rotulado como tal), nem qualquer claim clínica (escada de tiers: nenhum degrau empresta a autoridade do seguinte). Limites declarados: pesos e scores são julgamento estruturado single-rater; a calibração do estimador é na grade atual (refinamento futuro = grade mais fina, pré-declarado); PubMed-direto e identificação R8 pendem como conformidade do piloto.</w:t>
       </w:r>
     </w:p>
-    <w:bookmarkEnd w:id="77"/>
-    <w:bookmarkStart w:id="78" w:name="X18a39be5b705f9345ca546b899f7d7b5adefb6c"/>
+    <w:bookmarkEnd w:id="78"/>
+    <w:bookmarkStart w:id="79" w:name="X18a39be5b705f9345ca546b899f7d7b5adefb6c"/>
     <w:p>
       <w:pPr>
         <w:pStyle w:val="Heading3"/>
       </w:pPr>
       <w:r>
-        <w:t xml:space="preserve">6.2 Discussão: o que os resultados significam e o que não significam</w:t>
+        <w:t xml:space="preserve">10.2 Discussão: o que os resultados significam e o que não significam</w:t>
       </w:r>
     </w:p>
     <w:p>
@@ -10713,9 +10684,9 @@
         </w:pict>
       </w:r>
     </w:p>
-    <w:bookmarkEnd w:id="78"/>
     <w:bookmarkEnd w:id="79"/>
-    <w:bookmarkStart w:id="82" w:name="Xde54ec646f1f3a8391104cf1e0469c1c2e719d7"/>
+    <w:bookmarkEnd w:id="80"/>
+    <w:bookmarkStart w:id="83" w:name="Xde54ec646f1f3a8391104cf1e0469c1c2e719d7"/>
     <w:p>
       <w:pPr>
         <w:pStyle w:val="Heading1"/>
@@ -11056,7 +11027,7 @@
         <w:t xml:space="preserve">antes da formulação — quem quiser pular a matemática não perde o argumento.</w:t>
       </w:r>
     </w:p>
-    <w:bookmarkStart w:id="80" w:name="X9827a35e473ae76eaa9cc9cd1cb9fe7ccbd599e"/>
+    <w:bookmarkStart w:id="81" w:name="X9827a35e473ae76eaa9cc9cd1cb9fe7ccbd599e"/>
     <w:p>
       <w:pPr>
         <w:pStyle w:val="Heading3"/>
@@ -11151,8 +11122,8 @@
         <w:t xml:space="preserve">(i) a variante G127V, achada pela evolução no kuru, pode travar a replicação do príon por competição (dominante-negativo) sem silenciar a proteína nativa; (ii) a simulação parametrizada com dados publicados entrega regras quantitativas de dose-e-posicionamento (anel 8–12 mm · redose ≤7 d · limiar θ*≈⅓ · banda A6 0,0–2,6 µg/depósito) com predições travadas ANTES de qualquer medição — o limiar aproximadamente conservado entre espécies (Cenário B), dose titulada à velocidade da doença; (iii) nada disto é aplicável a humanos antes do gate organoide (G0-wet) — a não-promessa é parte do método, não um enfeite.</w:t>
       </w:r>
     </w:p>
-    <w:bookmarkEnd w:id="80"/>
-    <w:bookmarkStart w:id="81" w:name="Xa49a5ebd94827c9b28806906c903446734dad5d"/>
+    <w:bookmarkEnd w:id="81"/>
+    <w:bookmarkStart w:id="82" w:name="Xa49a5ebd94827c9b28806906c903446734dad5d"/>
     <w:p>
       <w:pPr>
         <w:pStyle w:val="Heading3"/>
@@ -11455,9 +11426,9 @@
         </w:pict>
       </w:r>
     </w:p>
-    <w:bookmarkEnd w:id="81"/>
     <w:bookmarkEnd w:id="82"/>
-    <w:bookmarkStart w:id="83" w:name="Xe34947707e5e8ecace4a1b54c2b0a73a9e257f2"/>
+    <w:bookmarkEnd w:id="83"/>
+    <w:bookmarkStart w:id="84" w:name="Xe34947707e5e8ecace4a1b54c2b0a73a9e257f2"/>
     <w:p>
       <w:pPr>
         <w:pStyle w:val="Heading1"/>
@@ -11652,8 +11623,8 @@
         </w:pict>
       </w:r>
     </w:p>
-    <w:bookmarkEnd w:id="83"/>
-    <w:bookmarkStart w:id="84" w:name="capítulo-13-conclusões-por-objetivo"/>
+    <w:bookmarkEnd w:id="84"/>
+    <w:bookmarkStart w:id="85" w:name="capítulo-13-conclusões-por-objetivo"/>
     <w:p>
       <w:pPr>
         <w:pStyle w:val="Heading1"/>
@@ -11875,8 +11846,8 @@
         </w:pict>
       </w:r>
     </w:p>
-    <w:bookmarkEnd w:id="84"/>
-    <w:bookmarkStart w:id="86" w:name="referências-58-fontes-do-registro"/>
+    <w:bookmarkEnd w:id="85"/>
+    <w:bookmarkStart w:id="87" w:name="referências-58-fontes-do-registro"/>
     <w:p>
       <w:pPr>
         <w:pStyle w:val="Heading1"/>
@@ -12289,7 +12260,7 @@
         <w:t xml:space="preserve">.)</w:t>
       </w:r>
     </w:p>
-    <w:bookmarkStart w:id="85" w:name="X0e8293c776e2b2afcf3b4207772d4efc588edb0"/>
+    <w:bookmarkStart w:id="86" w:name="X0e8293c776e2b2afcf3b4207772d4efc588edb0"/>
     <w:p>
       <w:pPr>
         <w:pStyle w:val="Heading3"/>
@@ -12339,9 +12310,9 @@
         </w:pict>
       </w:r>
     </w:p>
-    <w:bookmarkEnd w:id="85"/>
     <w:bookmarkEnd w:id="86"/>
-    <w:bookmarkStart w:id="90" w:name="X1c2f38414f27504124a750ab9aa28c342c478a4"/>
+    <w:bookmarkEnd w:id="87"/>
+    <w:bookmarkStart w:id="91" w:name="X1c2f38414f27504124a750ab9aa28c342c478a4"/>
     <w:p>
       <w:pPr>
         <w:pStyle w:val="Heading1"/>
@@ -12873,7 +12844,7 @@
         <w:t xml:space="preserve">Nota de integridade da auditoria 27/08 (tarde): dois defeitos encontrados e corrigidos no próprio ato — JSON da v11 truncado por erro de serialização (regenerado por script salvo, seed idêntica, veredito idêntico) e sinal do bias pooled invertido na prosa (−0,008 conforme o JSON; corrigido nos três documentos). Ambos registrados aqui porque a auditoria que não publica suas correções não é auditoria.</w:t>
       </w:r>
     </w:p>
-    <w:bookmarkStart w:id="88" w:name="referências-e-concordância"/>
+    <w:bookmarkStart w:id="89" w:name="referências-e-concordância"/>
     <w:p>
       <w:pPr>
         <w:pStyle w:val="Heading2"/>
@@ -12882,7 +12853,7 @@
         <w:t xml:space="preserve">REFERÊNCIAS E CONCORDÂNCIA</w:t>
       </w:r>
     </w:p>
-    <w:bookmarkStart w:id="87" w:name="X9ce5b957f5dc85c2f6cfccd1f0f5723387b9924"/>
+    <w:bookmarkStart w:id="88" w:name="X9ce5b957f5dc85c2f6cfccd1f0f5723387b9924"/>
     <w:p>
       <w:pPr>
         <w:pStyle w:val="Heading3"/>
@@ -14997,9 +14968,9 @@
         </w:tc>
       </w:tr>
     </w:tbl>
-    <w:bookmarkEnd w:id="87"/>
     <w:bookmarkEnd w:id="88"/>
-    <w:bookmarkStart w:id="89" w:name="Xeb275a038583099cfb46b2322654844c21c5dce"/>
+    <w:bookmarkEnd w:id="89"/>
+    <w:bookmarkStart w:id="90" w:name="Xeb275a038583099cfb46b2322654844c21c5dce"/>
     <w:p>
       <w:pPr>
         <w:pStyle w:val="Heading2"/>
@@ -15031,9 +15002,9 @@
         </w:pict>
       </w:r>
     </w:p>
-    <w:bookmarkEnd w:id="89"/>
     <w:bookmarkEnd w:id="90"/>
-    <w:bookmarkStart w:id="97" w:name="X1c8b50832457c682b8843bf2ca4531697f012cf"/>
+    <w:bookmarkEnd w:id="91"/>
+    <w:bookmarkStart w:id="98" w:name="X1c8b50832457c682b8843bf2ca4531697f012cf"/>
     <w:p>
       <w:pPr>
         <w:pStyle w:val="Heading1"/>
@@ -15042,7 +15013,7 @@
         <w:t xml:space="preserve">APÊNDICE B — MAPA DA LÓGICA COMPLETA (de onde veio cada informação e como se conecta)</w:t>
       </w:r>
     </w:p>
-    <w:bookmarkStart w:id="91" w:name="Xb095c77311f8507f9e6398adad52f5d9f8268d8"/>
+    <w:bookmarkStart w:id="92" w:name="Xb095c77311f8507f9e6398adad52f5d9f8268d8"/>
     <w:p>
       <w:pPr>
         <w:pStyle w:val="Heading2"/>
@@ -15053,653 +15024,626 @@
     </w:p>
     <w:p>
       <w:pPr>
-        <w:pStyle w:val="SourceCode"/>
-      </w:pPr>
-      <w:r>
-        <w:rPr>
-          <w:rStyle w:val="VerbatimChar"/>
-        </w:rPr>
-        <w:t xml:space="preserve">CAMADA 0: FONTE PRIMÁRIA (papers publicados)</w:t>
-      </w:r>
-      <w:r>
-        <w:br/>
-      </w:r>
-      <w:r>
-        <w:rPr>
-          <w:rStyle w:val="VerbatimChar"/>
-        </w:rPr>
-        <w:t xml:space="preserve">═══════════════════════════════════════════════════</w:t>
-      </w:r>
-      <w:r>
-        <w:br/>
-      </w:r>
-      <w:r>
-        <w:rPr>
-          <w:rStyle w:val="VerbatimChar"/>
-        </w:rPr>
-        <w:t xml:space="preserve">  Asante 2015 [E001]     Mead 2009 [E002]     Groveman 2019 [E007]</w:t>
-      </w:r>
-      <w:r>
-        <w:br/>
-      </w:r>
-      <w:r>
-        <w:rPr>
-          <w:rStyle w:val="VerbatimChar"/>
-        </w:rPr>
-        <w:t xml:space="preserve">  Nature, peer-reviewed   NEJM, peer-reviewed   Acta Neuropathol, peer-reviewed</w:t>
-      </w:r>
-      <w:r>
-        <w:br/>
-      </w:r>
-      <w:r>
-        <w:rPr>
-          <w:rStyle w:val="VerbatimChar"/>
-        </w:rPr>
-        <w:t xml:space="preserve">  "V127 resiste a príons" "G127V seleção kuru"  "Organoides infectam com sCJD"</w:t>
-      </w:r>
-      <w:r>
-        <w:br/>
-      </w:r>
-      <w:r>
-        <w:rPr>
-          <w:rStyle w:val="VerbatimChar"/>
-        </w:rPr>
-        <w:t xml:space="preserve">         │                       │                       │</w:t>
-      </w:r>
-      <w:r>
-        <w:br/>
-      </w:r>
-      <w:r>
-        <w:rPr>
-          <w:rStyle w:val="VerbatimChar"/>
-        </w:rPr>
-        <w:t xml:space="preserve">         ▼                       ▼                       ▼</w:t>
-      </w:r>
-      <w:r>
-        <w:br/>
-      </w:r>
-      <w:r>
-        <w:rPr>
-          <w:rStyle w:val="VerbatimChar"/>
-        </w:rPr>
-        <w:t xml:space="preserve">CAMADA 1: VERIFICAÇÃO (auditoria de fonte)</w:t>
-      </w:r>
-      <w:r>
-        <w:br/>
-      </w:r>
-      <w:r>
-        <w:rPr>
-          <w:rStyle w:val="VerbatimChar"/>
-        </w:rPr>
-        <w:t xml:space="preserve">═══════════════════════════════════════════════════</w:t>
-      </w:r>
-      <w:r>
-        <w:br/>
-      </w:r>
-      <w:r>
-        <w:rPr>
-          <w:rStyle w:val="VerbatimChar"/>
-        </w:rPr>
-        <w:t xml:space="preserve">  Cada fonte foi ABERTA (URL/DOI confirmado)</w:t>
-      </w:r>
-      <w:r>
-        <w:br/>
-      </w:r>
-      <w:r>
-        <w:rPr>
-          <w:rStyle w:val="VerbatimChar"/>
-        </w:rPr>
-        <w:t xml:space="preserve">  Identificadores verificados → E-registry</w:t>
-      </w:r>
-      <w:r>
-        <w:br/>
-      </w:r>
-      <w:r>
-        <w:rPr>
-          <w:rStyle w:val="VerbatimChar"/>
-        </w:rPr>
-        <w:t xml:space="preserve">  Status: verified (quem abriu, quando, como)</w:t>
-      </w:r>
-      <w:r>
-        <w:br/>
-      </w:r>
-      <w:r>
-        <w:rPr>
-          <w:rStyle w:val="VerbatimChar"/>
-        </w:rPr>
-        <w:t xml:space="preserve">         │</w:t>
-      </w:r>
-      <w:r>
-        <w:br/>
-      </w:r>
-      <w:r>
-        <w:rPr>
-          <w:rStyle w:val="VerbatimChar"/>
-        </w:rPr>
-        <w:t xml:space="preserve">         ▼</w:t>
-      </w:r>
-      <w:r>
-        <w:br/>
-      </w:r>
-      <w:r>
-        <w:rPr>
-          <w:rStyle w:val="VerbatimChar"/>
-        </w:rPr>
-        <w:t xml:space="preserve">CAMADA 2: CLAIM REGISTRY (afirmações extraídas)</w:t>
-      </w:r>
-      <w:r>
-        <w:br/>
-      </w:r>
-      <w:r>
-        <w:rPr>
-          <w:rStyle w:val="VerbatimChar"/>
-        </w:rPr>
-        <w:t xml:space="preserve">═══════════════════════════════════════════════════</w:t>
-      </w:r>
-      <w:r>
-        <w:br/>
-      </w:r>
-      <w:r>
-        <w:rPr>
-          <w:rStyle w:val="VerbatimChar"/>
-        </w:rPr>
-        <w:t xml:space="preserve">  C001: "V127/V127 resiste completamente"      [E001]</w:t>
-      </w:r>
-      <w:r>
-        <w:br/>
-      </w:r>
-      <w:r>
-        <w:rPr>
-          <w:rStyle w:val="VerbatimChar"/>
-        </w:rPr>
-        <w:t xml:space="preserve">  C003: "DN dose-dependente"                   [E001,E003,E005]</w:t>
-      </w:r>
-      <w:r>
-        <w:br/>
-      </w:r>
-      <w:r>
-        <w:rPr>
-          <w:rStyle w:val="VerbatimChar"/>
-        </w:rPr>
-        <w:t xml:space="preserve">  C005: "anchorless trans DN"                  [E003]</w:t>
-      </w:r>
-      <w:r>
-        <w:br/>
-      </w:r>
-      <w:r>
-        <w:rPr>
-          <w:rStyle w:val="VerbatimChar"/>
-        </w:rPr>
-        <w:t xml:space="preserve">  C010: "âncoras de relógio: 25-28/35/169 dpi" [E007]</w:t>
-      </w:r>
-      <w:r>
-        <w:br/>
-      </w:r>
-      <w:r>
-        <w:rPr>
-          <w:rStyle w:val="VerbatimChar"/>
-        </w:rPr>
-        <w:t xml:space="preserve">  C011: "títulos MV2 vs MV1 @169dpi"           [E007]</w:t>
-      </w:r>
-      <w:r>
-        <w:br/>
-      </w:r>
-      <w:r>
-        <w:rPr>
-          <w:rStyle w:val="VerbatimChar"/>
-        </w:rPr>
-        <w:t xml:space="preserve">         │</w:t>
-      </w:r>
-      <w:r>
-        <w:br/>
-      </w:r>
-      <w:r>
-        <w:rPr>
-          <w:rStyle w:val="VerbatimChar"/>
-        </w:rPr>
-        <w:t xml:space="preserve">         ▼</w:t>
-      </w:r>
-      <w:r>
-        <w:br/>
-      </w:r>
-      <w:r>
-        <w:rPr>
-          <w:rStyle w:val="VerbatimChar"/>
-        </w:rPr>
-        <w:t xml:space="preserve">CAMADA 3: PARÂMETROS (números com proveniência)</w:t>
-      </w:r>
-      <w:r>
-        <w:br/>
-      </w:r>
-      <w:r>
-        <w:rPr>
-          <w:rStyle w:val="VerbatimChar"/>
-        </w:rPr>
-        <w:t xml:space="preserve">═══════════════════════════════════════════════════</w:t>
-      </w:r>
-      <w:r>
-        <w:br/>
-      </w:r>
-      <w:r>
-        <w:rPr>
-          <w:rStyle w:val="VerbatimChar"/>
-        </w:rPr>
-        <w:t xml:space="preserve">  α=0.20, λ=1.8     ← Thorne &amp; Nicholson 2006 [E010] (in-vivo, humano)</w:t>
-      </w:r>
-      <w:r>
-        <w:br/>
-      </w:r>
-      <w:r>
-        <w:rPr>
-          <w:rStyle w:val="VerbatimChar"/>
-        </w:rPr>
-        <w:t xml:space="preserve">  D₀=1.25e-10 m²/s  ← Stokes-Einstein (R_h≈2.5nm, ~30kDa)</w:t>
-      </w:r>
-      <w:r>
-        <w:br/>
-      </w:r>
-      <w:r>
-        <w:rPr>
-          <w:rStyle w:val="VerbatimChar"/>
-        </w:rPr>
-        <w:t xml:space="preserve">  D_eff=3.86e-11    ← D₀/λ² (derivado)</w:t>
-      </w:r>
-      <w:r>
-        <w:br/>
-      </w:r>
-      <w:r>
-        <w:rPr>
-          <w:rStyle w:val="VerbatimChar"/>
-        </w:rPr>
-        <w:t xml:space="preserve">  k_eff=1e-6–1e-5   ← Masel 1999 [E011] (polimerização nucleada)</w:t>
-      </w:r>
-      <w:r>
-        <w:br/>
-      </w:r>
-      <w:r>
-        <w:rPr>
-          <w:rStyle w:val="VerbatimChar"/>
-        </w:rPr>
-        <w:t xml:space="preserve">  t_dupl=12.1 d     ← 134d/log₂(2130) [E007] (derivado de Groveman)</w:t>
-      </w:r>
-      <w:r>
-        <w:br/>
-      </w:r>
-      <w:r>
-        <w:rPr>
-          <w:rStyle w:val="VerbatimChar"/>
-        </w:rPr>
-        <w:t xml:space="preserve">  1 unidade=144 d   ← t_dupl/t_dupl_sim [E032] (derivado)</w:t>
-      </w:r>
-      <w:r>
-        <w:br/>
-      </w:r>
-      <w:r>
-        <w:rPr>
-          <w:rStyle w:val="VerbatimChar"/>
-        </w:rPr>
-        <w:t xml:space="preserve">         │</w:t>
-      </w:r>
-      <w:r>
-        <w:br/>
-      </w:r>
-      <w:r>
-        <w:rPr>
-          <w:rStyle w:val="VerbatimChar"/>
-        </w:rPr>
-        <w:t xml:space="preserve">         ▼</w:t>
-      </w:r>
-      <w:r>
-        <w:br/>
-      </w:r>
-      <w:r>
-        <w:rPr>
-          <w:rStyle w:val="VerbatimChar"/>
-        </w:rPr>
-        <w:t xml:space="preserve">CAMADA 4: MODELO MATEMÁTICO (equações com parâmetros)</w:t>
-      </w:r>
-      <w:r>
-        <w:br/>
-      </w:r>
-      <w:r>
-        <w:rPr>
-          <w:rStyle w:val="VerbatimChar"/>
-        </w:rPr>
-        <w:t xml:space="preserve">═══════════════════════════════════════════════════</w:t>
-      </w:r>
-      <w:r>
-        <w:br/>
-      </w:r>
-      <w:r>
-        <w:rPr>
-          <w:rStyle w:val="VerbatimChar"/>
-        </w:rPr>
-        <w:t xml:space="preserve">  $$\frac{\partial(\alpha c)}{\partial t} = \nabla\!\cdot\!(D_{\mathrm{eff}}\,\nabla c) \;-\; \nabla\!\cdot\!(\mathbf{v}\,c) \;+\; S(\mathbf{x}) \;-\; k_{\mathrm{eff}}\,c$$</w:t>
-      </w:r>
-      <w:r>
-        <w:br/>
-      </w:r>
-      <w:r>
-        <w:rPr>
-          <w:rStyle w:val="VerbatimChar"/>
-        </w:rPr>
-        <w:t xml:space="preserve">  → solver WS-7 (volumes finitos, 192², auto-testado)</w:t>
-      </w:r>
-      <w:r>
-        <w:br/>
-      </w:r>
-      <w:r>
-        <w:br/>
-      </w:r>
-      <w:r>
-        <w:rPr>
-          <w:rStyle w:val="VerbatimChar"/>
-        </w:rPr>
-        <w:t xml:space="preserve">  freeS(r) = (1+κ·c_V127(r))⁻²</w:t>
-      </w:r>
-      <w:r>
-        <w:br/>
-      </w:r>
-      <w:r>
-        <w:rPr>
-          <w:rStyle w:val="VerbatimChar"/>
-        </w:rPr>
-        <w:t xml:space="preserve">  → modelo WS-9 (campo-médio, 96², humanizado)</w:t>
-      </w:r>
-      <w:r>
-        <w:br/>
-      </w:r>
-      <w:r>
-        <w:br/>
-      </w:r>
-      <w:r>
-        <w:rPr>
-          <w:rStyle w:val="VerbatimChar"/>
-        </w:rPr>
-        <w:t xml:space="preserve">  θ ≡ (1+κ·c_pico)⁻¹</w:t>
-      </w:r>
-      <w:r>
-        <w:br/>
-      </w:r>
-      <w:r>
-        <w:rPr>
-          <w:rStyle w:val="VerbatimChar"/>
-        </w:rPr>
-        <w:t xml:space="preserve">  → definição formal (a fração de replicação que resta)</w:t>
-      </w:r>
-      <w:r>
-        <w:br/>
-      </w:r>
-      <w:r>
-        <w:rPr>
-          <w:rStyle w:val="VerbatimChar"/>
-        </w:rPr>
-        <w:t xml:space="preserve">         │</w:t>
-      </w:r>
-      <w:r>
-        <w:br/>
-      </w:r>
-      <w:r>
-        <w:rPr>
-          <w:rStyle w:val="VerbatimChar"/>
-        </w:rPr>
-        <w:t xml:space="preserve">         ▼</w:t>
-      </w:r>
-      <w:r>
-        <w:br/>
-      </w:r>
-      <w:r>
-        <w:rPr>
-          <w:rStyle w:val="VerbatimChar"/>
-        </w:rPr>
-        <w:t xml:space="preserve">CAMADA 5: EXECUÇÃO (runs arquivados e reproduzidos)</w:t>
-      </w:r>
-      <w:r>
-        <w:br/>
-      </w:r>
-      <w:r>
-        <w:rPr>
-          <w:rStyle w:val="VerbatimChar"/>
-        </w:rPr>
-        <w:t xml:space="preserve">═══════════════════════════════════════════════════</w:t>
-      </w:r>
-      <w:r>
-        <w:br/>
-      </w:r>
-      <w:r>
-        <w:rPr>
-          <w:rStyle w:val="VerbatimChar"/>
-        </w:rPr>
-        <w:t xml:space="preserve">  WS-7 self-tests: massa=100%, Thiele=0.5% ✓</w:t>
-      </w:r>
-      <w:r>
-        <w:br/>
-      </w:r>
-      <w:r>
-        <w:rPr>
-          <w:rStyle w:val="VerbatimChar"/>
-        </w:rPr>
-        <w:t xml:space="preserve">  WS-9 T1/T2/T3: todos PASS ✓</w:t>
-      </w:r>
-      <w:r>
-        <w:br/>
-      </w:r>
-      <w:r>
-        <w:rPr>
-          <w:rStyle w:val="VerbatimChar"/>
-        </w:rPr>
-        <w:t xml:space="preserve">  Reprodução: executado em 2 ambientes independentes</w:t>
-      </w:r>
-      <w:r>
-        <w:br/>
-      </w:r>
-      <w:r>
-        <w:rPr>
-          <w:rStyle w:val="VerbatimChar"/>
-        </w:rPr>
-        <w:t xml:space="preserve">  → resultados idênticos (hash confirmado)</w:t>
-      </w:r>
-      <w:r>
-        <w:br/>
-      </w:r>
-      <w:r>
-        <w:rPr>
-          <w:rStyle w:val="VerbatimChar"/>
-        </w:rPr>
-        <w:t xml:space="preserve">         │</w:t>
-      </w:r>
-      <w:r>
-        <w:br/>
-      </w:r>
-      <w:r>
-        <w:rPr>
-          <w:rStyle w:val="VerbatimChar"/>
-        </w:rPr>
-        <w:t xml:space="preserve">         ▼</w:t>
-      </w:r>
-      <w:r>
-        <w:br/>
-      </w:r>
-      <w:r>
-        <w:rPr>
-          <w:rStyle w:val="VerbatimChar"/>
-        </w:rPr>
-        <w:t xml:space="preserve">CAMADA 6: RESULTADOS [SIM]</w:t>
-      </w:r>
-      <w:r>
-        <w:br/>
-      </w:r>
-      <w:r>
-        <w:rPr>
-          <w:rStyle w:val="VerbatimChar"/>
-        </w:rPr>
-        <w:t xml:space="preserve">═══════════════════════════════════════════════════</w:t>
-      </w:r>
-      <w:r>
-        <w:br/>
-      </w:r>
-      <w:r>
-        <w:rPr>
-          <w:rStyle w:val="VerbatimChar"/>
-        </w:rPr>
-        <w:t xml:space="preserve">  θ*=0.333          ← do sweep κ (limiar de contenção)</w:t>
-      </w:r>
-      <w:r>
-        <w:br/>
-      </w:r>
-      <w:r>
-        <w:rPr>
-          <w:rStyle w:val="VerbatimChar"/>
-        </w:rPr>
-        <w:t xml:space="preserve">  Regras 1-3        ← do solver WS-7 (anel/malha/redose)</w:t>
-      </w:r>
-      <w:r>
-        <w:br/>
-      </w:r>
-      <w:r>
-        <w:rPr>
-          <w:rStyle w:val="VerbatimChar"/>
-        </w:rPr>
-        <w:t xml:space="preserve">  Discriminadora    ← do sweep expoente (C50 insensível)</w:t>
-      </w:r>
-      <w:r>
-        <w:br/>
-      </w:r>
-      <w:r>
-        <w:rPr>
-          <w:rStyle w:val="VerbatimChar"/>
-        </w:rPr>
-        <w:t xml:space="preserve">  Estimador θ_obs   ← da calibração sim-a-sim</w:t>
-      </w:r>
-      <w:r>
-        <w:br/>
-      </w:r>
-      <w:r>
-        <w:rPr>
-          <w:rStyle w:val="VerbatimChar"/>
-        </w:rPr>
-        <w:t xml:space="preserve">         │</w:t>
-      </w:r>
-      <w:r>
-        <w:br/>
-      </w:r>
-      <w:r>
-        <w:rPr>
-          <w:rStyle w:val="VerbatimChar"/>
-        </w:rPr>
-        <w:t xml:space="preserve">         ▼</w:t>
-      </w:r>
-      <w:r>
-        <w:br/>
-      </w:r>
-      <w:r>
-        <w:rPr>
-          <w:rStyle w:val="VerbatimChar"/>
-        </w:rPr>
-        <w:t xml:space="preserve">CAMADA 7: PROGNÓSTICO TRAVADO</w:t>
-      </w:r>
-      <w:r>
-        <w:br/>
-      </w:r>
-      <w:r>
-        <w:rPr>
-          <w:rStyle w:val="VerbatimChar"/>
-        </w:rPr>
-        <w:t xml:space="preserve">═══════════════════════════════════════════════════</w:t>
-      </w:r>
-      <w:r>
-        <w:br/>
-      </w:r>
-      <w:r>
-        <w:rPr>
-          <w:rStyle w:val="VerbatimChar"/>
-        </w:rPr>
-        <w:t xml:space="preserve">  Release v1.0 (timestamp): "θ&lt;0.33 ⇒ contenção"</w:t>
-      </w:r>
-      <w:r>
-        <w:br/>
-      </w:r>
-      <w:r>
-        <w:rPr>
-          <w:rStyle w:val="VerbatimChar"/>
-        </w:rPr>
-        <w:t xml:space="preserve">  → ANTES de qualquer dado experimental</w:t>
-      </w:r>
-      <w:r>
-        <w:br/>
-      </w:r>
-      <w:r>
-        <w:rPr>
-          <w:rStyle w:val="VerbatimChar"/>
-        </w:rPr>
-        <w:t xml:space="preserve">  → ANTI-HINDSIGHT por construção</w:t>
-      </w:r>
-      <w:r>
-        <w:br/>
-      </w:r>
-      <w:r>
-        <w:rPr>
-          <w:rStyle w:val="VerbatimChar"/>
-        </w:rPr>
-        <w:t xml:space="preserve">         │</w:t>
-      </w:r>
-      <w:r>
-        <w:br/>
-      </w:r>
-      <w:r>
-        <w:rPr>
-          <w:rStyle w:val="VerbatimChar"/>
-        </w:rPr>
-        <w:t xml:space="preserve">         ▼</w:t>
-      </w:r>
-      <w:r>
-        <w:br/>
-      </w:r>
-      <w:r>
-        <w:rPr>
-          <w:rStyle w:val="VerbatimChar"/>
-        </w:rPr>
-        <w:t xml:space="preserve">CAMADA 8: CONCLUSÕES DA TESE</w:t>
-      </w:r>
-      <w:r>
-        <w:br/>
-      </w:r>
-      <w:r>
-        <w:rPr>
-          <w:rStyle w:val="VerbatimChar"/>
-        </w:rPr>
-        <w:t xml:space="preserve">═══════════════════════════════════════════════════</w:t>
-      </w:r>
-      <w:r>
-        <w:br/>
-      </w:r>
-      <w:r>
-        <w:rPr>
-          <w:rStyle w:val="VerbatimChar"/>
-        </w:rPr>
-        <w:t xml:space="preserve">  A tese entrega: método (etrização P0-P6) + prognóstico (θ*, regras)</w:t>
-      </w:r>
-      <w:r>
-        <w:br/>
-      </w:r>
-      <w:r>
-        <w:rPr>
-          <w:rStyle w:val="VerbatimChar"/>
-        </w:rPr>
-        <w:t xml:space="preserve">  + dupla potencialidade (cura + restauração [C016])</w:t>
-      </w:r>
-      <w:r>
-        <w:br/>
-      </w:r>
-      <w:r>
-        <w:rPr>
-          <w:rStyle w:val="VerbatimChar"/>
-        </w:rPr>
-        <w:t xml:space="preserve">  + ressalva (não aplicar em humanos sem validação experimental)</w:t>
-      </w:r>
-    </w:p>
-    <w:bookmarkEnd w:id="91"/>
-    <w:bookmarkStart w:id="92" w:name="Xcf01aafabbe100b4fa70984246fa3859d33e508"/>
+        <w:pStyle w:val="FirstParagraph"/>
+      </w:pPr>
+      <w:r>
+        <w:rPr>
+          <w:bCs/>
+          <w:b/>
+        </w:rPr>
+        <w:t xml:space="preserve">CAMADA 0 — Fonte primária (papers publicados):</w:t>
+      </w:r>
+      <w:r>
+        <w:t xml:space="preserve"> </w:t>
+      </w:r>
+      <w:r>
+        <w:t xml:space="preserve">Asante 2015 [E001] (Nature,</w:t>
+      </w:r>
+      <w:r>
+        <w:t xml:space="preserve"> </w:t>
+      </w:r>
+      <w:r>
+        <w:t xml:space="preserve">“</w:t>
+      </w:r>
+      <w:r>
+        <w:t xml:space="preserve">V127 resiste a príons</w:t>
+      </w:r>
+      <w:r>
+        <w:t xml:space="preserve">”</w:t>
+      </w:r>
+      <w:r>
+        <w:t xml:space="preserve">) · Mead 2009 [E002] (NEJM,</w:t>
+      </w:r>
+      <w:r>
+        <w:t xml:space="preserve"> </w:t>
+      </w:r>
+      <w:r>
+        <w:t xml:space="preserve">“</w:t>
+      </w:r>
+      <w:r>
+        <w:t xml:space="preserve">G127V seleção kuru</w:t>
+      </w:r>
+      <w:r>
+        <w:t xml:space="preserve">”</w:t>
+      </w:r>
+      <w:r>
+        <w:t xml:space="preserve">) · Groveman 2019 [E007] (Acta Neuropathol,</w:t>
+      </w:r>
+      <w:r>
+        <w:t xml:space="preserve"> </w:t>
+      </w:r>
+      <w:r>
+        <w:t xml:space="preserve">“</w:t>
+      </w:r>
+      <w:r>
+        <w:t xml:space="preserve">Organoides infectam com sCJD</w:t>
+      </w:r>
+      <w:r>
+        <w:t xml:space="preserve">”</w:t>
+      </w:r>
+      <w:r>
+        <w:t xml:space="preserve">) — peer-reviewed.</w:t>
+      </w:r>
+    </w:p>
+    <w:p>
+      <w:pPr>
+        <w:pStyle w:val="BodyText"/>
+      </w:pPr>
+      <w:r>
+        <w:t xml:space="preserve">→</w:t>
+      </w:r>
+      <w:r>
+        <w:t xml:space="preserve"> </w:t>
+      </w:r>
+      <w:r>
+        <w:rPr>
+          <w:bCs/>
+          <w:b/>
+        </w:rPr>
+        <w:t xml:space="preserve">CAMADA 1 — Verificação (auditoria de fonte):</w:t>
+      </w:r>
+      <w:r>
+        <w:t xml:space="preserve"> </w:t>
+      </w:r>
+      <w:r>
+        <w:t xml:space="preserve">cada fonte foi ABERTA (URL/DOI confirmado); identificadores verificados → E-registry; status</w:t>
+      </w:r>
+      <w:r>
+        <w:t xml:space="preserve"> </w:t>
+      </w:r>
+      <w:r>
+        <w:rPr>
+          <w:iCs/>
+          <w:i/>
+        </w:rPr>
+        <w:t xml:space="preserve">verified</w:t>
+      </w:r>
+      <w:r>
+        <w:t xml:space="preserve"> </w:t>
+      </w:r>
+      <w:r>
+        <w:t xml:space="preserve">(quem abriu, quando, como).</w:t>
+      </w:r>
+    </w:p>
+    <w:p>
+      <w:pPr>
+        <w:pStyle w:val="BodyText"/>
+      </w:pPr>
+      <w:r>
+        <w:t xml:space="preserve">→</w:t>
+      </w:r>
+      <w:r>
+        <w:t xml:space="preserve"> </w:t>
+      </w:r>
+      <w:r>
+        <w:rPr>
+          <w:bCs/>
+          <w:b/>
+        </w:rPr>
+        <w:t xml:space="preserve">CAMADA 2 — Claim registry (afirmações extraídas):</w:t>
+      </w:r>
+      <w:r>
+        <w:t xml:space="preserve"> </w:t>
+      </w:r>
+      <w:r>
+        <w:t xml:space="preserve">C001</w:t>
+      </w:r>
+      <w:r>
+        <w:t xml:space="preserve"> </w:t>
+      </w:r>
+      <w:r>
+        <w:t xml:space="preserve">“</w:t>
+      </w:r>
+      <w:r>
+        <w:t xml:space="preserve">V127/V127 resiste completamente</w:t>
+      </w:r>
+      <w:r>
+        <w:t xml:space="preserve">”</w:t>
+      </w:r>
+      <w:r>
+        <w:t xml:space="preserve"> </w:t>
+      </w:r>
+      <w:r>
+        <w:t xml:space="preserve">[E001] · C003</w:t>
+      </w:r>
+      <w:r>
+        <w:t xml:space="preserve"> </w:t>
+      </w:r>
+      <w:r>
+        <w:t xml:space="preserve">“</w:t>
+      </w:r>
+      <w:r>
+        <w:t xml:space="preserve">DN dose-dependente</w:t>
+      </w:r>
+      <w:r>
+        <w:t xml:space="preserve">”</w:t>
+      </w:r>
+      <w:r>
+        <w:t xml:space="preserve"> </w:t>
+      </w:r>
+      <w:r>
+        <w:t xml:space="preserve">[E001,E003,E005] · C005</w:t>
+      </w:r>
+      <w:r>
+        <w:t xml:space="preserve"> </w:t>
+      </w:r>
+      <w:r>
+        <w:t xml:space="preserve">“</w:t>
+      </w:r>
+      <w:r>
+        <w:t xml:space="preserve">anchorless trans DN</w:t>
+      </w:r>
+      <w:r>
+        <w:t xml:space="preserve">”</w:t>
+      </w:r>
+      <w:r>
+        <w:t xml:space="preserve"> </w:t>
+      </w:r>
+      <w:r>
+        <w:t xml:space="preserve">[E003] · C010</w:t>
+      </w:r>
+      <w:r>
+        <w:t xml:space="preserve"> </w:t>
+      </w:r>
+      <w:r>
+        <w:t xml:space="preserve">“</w:t>
+      </w:r>
+      <w:r>
+        <w:t xml:space="preserve">âncoras de relógio 25-28/35/169 dpi</w:t>
+      </w:r>
+      <w:r>
+        <w:t xml:space="preserve">”</w:t>
+      </w:r>
+      <w:r>
+        <w:t xml:space="preserve"> </w:t>
+      </w:r>
+      <w:r>
+        <w:t xml:space="preserve">[E007] · C011</w:t>
+      </w:r>
+      <w:r>
+        <w:t xml:space="preserve"> </w:t>
+      </w:r>
+      <w:r>
+        <w:t xml:space="preserve">“</w:t>
+      </w:r>
+      <w:r>
+        <w:t xml:space="preserve">títulos MV2 vs MV1</w:t>
+      </w:r>
+      <w:r>
+        <w:t xml:space="preserve"> </w:t>
+      </w:r>
+      <w:r>
+        <w:t xml:space="preserve">@169dpi</w:t>
+      </w:r>
+      <w:r>
+        <w:t xml:space="preserve">”</w:t>
+      </w:r>
+      <w:r>
+        <w:t xml:space="preserve"> </w:t>
+      </w:r>
+      <w:r>
+        <w:t xml:space="preserve">[E007].</w:t>
+      </w:r>
+    </w:p>
+    <w:p>
+      <w:pPr>
+        <w:pStyle w:val="BodyText"/>
+      </w:pPr>
+      <w:r>
+        <w:t xml:space="preserve">→</w:t>
+      </w:r>
+      <w:r>
+        <w:t xml:space="preserve"> </w:t>
+      </w:r>
+      <w:r>
+        <w:rPr>
+          <w:bCs/>
+          <w:b/>
+        </w:rPr>
+        <w:t xml:space="preserve">CAMADA 3 — Parâmetros (números com proveniência):</w:t>
+      </w:r>
+      <w:r>
+        <w:t xml:space="preserve"> </w:t>
+      </w:r>
+      <w:r>
+        <w:t xml:space="preserve">α=0,20 e λ=1,8 ← Thorne &amp; Nicholson 2006 [E010] (in-vivo, humano) · D₀=1,25×10⁻¹⁰ m²/s ← Stokes-Einstein (R_h≈2,5 nm, ~30 kDa) · D_eff=3,86×10⁻¹¹ ← D₀/λ² (derivado) · k_eff=10⁻⁶–10⁻⁵ ← Masel 1999 [E011] · t_dupl=12,1 d ← 134d/log₂(2130) [E007] · 1 unidade=144 d ← t_dupl/t_dupl_sim [E032].</w:t>
+      </w:r>
+    </w:p>
+    <w:p>
+      <w:pPr>
+        <w:pStyle w:val="BodyText"/>
+      </w:pPr>
+      <w:r>
+        <w:t xml:space="preserve">→</w:t>
+      </w:r>
+      <w:r>
+        <w:t xml:space="preserve"> </w:t>
+      </w:r>
+      <w:r>
+        <w:rPr>
+          <w:bCs/>
+          <w:b/>
+        </w:rPr>
+        <w:t xml:space="preserve">CAMADA 4 — Modelo matemático (equações com parâmetros):</w:t>
+      </w:r>
+    </w:p>
+    <w:p>
+      <w:pPr>
+        <w:pStyle w:val="BodyText"/>
+      </w:pPr>
+      <m:oMathPara>
+        <m:oMathParaPr>
+          <m:jc m:val="center"/>
+        </m:oMathParaPr>
+        <m:oMath>
+          <m:f>
+            <m:fPr>
+              <m:type m:val="bar"/>
+            </m:fPr>
+            <m:num>
+              <m:r>
+                <m:rPr>
+                  <m:sty m:val="p"/>
+                </m:rPr>
+                <m:t>∂</m:t>
+              </m:r>
+              <m:d>
+                <m:dPr>
+                  <m:begChr m:val="("/>
+                  <m:endChr m:val=")"/>
+                  <m:sepChr m:val=""/>
+                  <m:grow/>
+                </m:dPr>
+                <m:e>
+                  <m:r>
+                    <m:t>α</m:t>
+                  </m:r>
+                  <m:r>
+                    <m:t>c</m:t>
+                  </m:r>
+                </m:e>
+              </m:d>
+            </m:num>
+            <m:den>
+              <m:r>
+                <m:rPr>
+                  <m:sty m:val="p"/>
+                </m:rPr>
+                <m:t>∂</m:t>
+              </m:r>
+              <m:r>
+                <m:t>t</m:t>
+              </m:r>
+            </m:den>
+          </m:f>
+          <m:r>
+            <m:rPr>
+              <m:sty m:val="p"/>
+            </m:rPr>
+            <m:t>=</m:t>
+          </m:r>
+          <m:r>
+            <m:rPr>
+              <m:sty m:val="p"/>
+            </m:rPr>
+            <m:t>∇</m:t>
+          </m:r>
+          <m:r>
+            <m:t>​</m:t>
+          </m:r>
+          <m:r>
+            <m:rPr>
+              <m:sty m:val="p"/>
+            </m:rPr>
+            <m:t>⋅</m:t>
+          </m:r>
+          <m:r>
+            <m:t>​</m:t>
+          </m:r>
+          <m:d>
+            <m:dPr>
+              <m:begChr m:val="("/>
+              <m:endChr m:val=")"/>
+              <m:sepChr m:val=""/>
+              <m:grow/>
+            </m:dPr>
+            <m:e>
+              <m:sSub>
+                <m:e>
+                  <m:r>
+                    <m:t>D</m:t>
+                  </m:r>
+                </m:e>
+                <m:sub>
+                  <m:r>
+                    <m:rPr>
+                      <m:sty m:val="p"/>
+                    </m:rPr>
+                    <m:t>e</m:t>
+                  </m:r>
+                  <m:r>
+                    <m:rPr>
+                      <m:sty m:val="p"/>
+                    </m:rPr>
+                    <m:t>f</m:t>
+                  </m:r>
+                  <m:r>
+                    <m:rPr>
+                      <m:sty m:val="p"/>
+                    </m:rPr>
+                    <m:t>f</m:t>
+                  </m:r>
+                </m:sub>
+              </m:sSub>
+              <m:r>
+                <m:t> </m:t>
+              </m:r>
+              <m:r>
+                <m:rPr>
+                  <m:sty m:val="p"/>
+                </m:rPr>
+                <m:t>∇</m:t>
+              </m:r>
+              <m:r>
+                <m:t>c</m:t>
+              </m:r>
+            </m:e>
+          </m:d>
+          <m:r>
+            <m:t> </m:t>
+          </m:r>
+          <m:r>
+            <m:rPr>
+              <m:sty m:val="p"/>
+            </m:rPr>
+            <m:t>−</m:t>
+          </m:r>
+          <m:r>
+            <m:t> </m:t>
+          </m:r>
+          <m:r>
+            <m:rPr>
+              <m:sty m:val="p"/>
+            </m:rPr>
+            <m:t>∇</m:t>
+          </m:r>
+          <m:r>
+            <m:t>​</m:t>
+          </m:r>
+          <m:r>
+            <m:rPr>
+              <m:sty m:val="p"/>
+            </m:rPr>
+            <m:t>⋅</m:t>
+          </m:r>
+          <m:r>
+            <m:t>​</m:t>
+          </m:r>
+          <m:d>
+            <m:dPr>
+              <m:begChr m:val="("/>
+              <m:endChr m:val=")"/>
+              <m:sepChr m:val=""/>
+              <m:grow/>
+            </m:dPr>
+            <m:e>
+              <m:r>
+                <m:rPr>
+                  <m:sty m:val="b"/>
+                </m:rPr>
+                <m:t>v</m:t>
+              </m:r>
+              <m:r>
+                <m:t> </m:t>
+              </m:r>
+              <m:r>
+                <m:t>c</m:t>
+              </m:r>
+            </m:e>
+          </m:d>
+          <m:r>
+            <m:t> </m:t>
+          </m:r>
+          <m:r>
+            <m:rPr>
+              <m:sty m:val="p"/>
+            </m:rPr>
+            <m:t>+</m:t>
+          </m:r>
+          <m:r>
+            <m:t> </m:t>
+          </m:r>
+          <m:r>
+            <m:t>S</m:t>
+          </m:r>
+          <m:d>
+            <m:dPr>
+              <m:begChr m:val="("/>
+              <m:endChr m:val=")"/>
+              <m:sepChr m:val=""/>
+              <m:grow/>
+            </m:dPr>
+            <m:e>
+              <m:r>
+                <m:rPr>
+                  <m:sty m:val="b"/>
+                </m:rPr>
+                <m:t>x</m:t>
+              </m:r>
+            </m:e>
+          </m:d>
+          <m:r>
+            <m:t> </m:t>
+          </m:r>
+          <m:r>
+            <m:rPr>
+              <m:sty m:val="p"/>
+            </m:rPr>
+            <m:t>−</m:t>
+          </m:r>
+          <m:r>
+            <m:t> </m:t>
+          </m:r>
+          <m:sSub>
+            <m:e>
+              <m:r>
+                <m:t>k</m:t>
+              </m:r>
+            </m:e>
+            <m:sub>
+              <m:r>
+                <m:rPr>
+                  <m:sty m:val="p"/>
+                </m:rPr>
+                <m:t>e</m:t>
+              </m:r>
+              <m:r>
+                <m:rPr>
+                  <m:sty m:val="p"/>
+                </m:rPr>
+                <m:t>f</m:t>
+              </m:r>
+              <m:r>
+                <m:rPr>
+                  <m:sty m:val="p"/>
+                </m:rPr>
+                <m:t>f</m:t>
+              </m:r>
+            </m:sub>
+          </m:sSub>
+          <m:r>
+            <m:t> </m:t>
+          </m:r>
+          <m:r>
+            <m:t>c</m:t>
+          </m:r>
+        </m:oMath>
+      </m:oMathPara>
+    </w:p>
+    <w:p>
+      <w:pPr>
+        <w:pStyle w:val="FirstParagraph"/>
+      </w:pPr>
+      <w:r>
+        <w:t xml:space="preserve">→ solver WS-7 (volumes finitos, 192², auto-testado) · freeS(r)=(1+κ·c_V127(r))⁻² → modelo WS-9 (campo-médio, 96², humanizado) · θ≡(1+κ·c_pico)⁻¹ → definição formal (a fração de replicação que resta).</w:t>
+      </w:r>
+      <w:r>
+        <w:t xml:space="preserve"> </w:t>
+      </w:r>
+      <w:r>
+        <w:t xml:space="preserve">→</w:t>
+      </w:r>
+      <w:r>
+        <w:t xml:space="preserve"> </w:t>
+      </w:r>
+      <w:r>
+        <w:rPr>
+          <w:bCs/>
+          <w:b/>
+        </w:rPr>
+        <w:t xml:space="preserve">CAMADA 5 — Execução [SIM]:</w:t>
+      </w:r>
+      <w:r>
+        <w:t xml:space="preserve"> </w:t>
+      </w:r>
+      <w:r>
+        <w:t xml:space="preserve">sweeps (S1/S2/S3), grade κ, calibração do estimador; runs arquivados com hash; reprodução em 2 ambientes.</w:t>
+      </w:r>
+    </w:p>
+    <w:p>
+      <w:pPr>
+        <w:pStyle w:val="BodyText"/>
+      </w:pPr>
+      <w:r>
+        <w:t xml:space="preserve">→</w:t>
+      </w:r>
+      <w:r>
+        <w:t xml:space="preserve"> </w:t>
+      </w:r>
+      <w:r>
+        <w:rPr>
+          <w:bCs/>
+          <w:b/>
+        </w:rPr>
+        <w:t xml:space="preserve">CAMADA 6 — Colheita com critérios pré-declarados:</w:t>
+      </w:r>
+      <w:r>
+        <w:t xml:space="preserve"> </w:t>
+      </w:r>
+      <w:r>
+        <w:t xml:space="preserve">veredito ADEQUADO na fronteira; refutações reportadas (hamster; v1.1).</w:t>
+      </w:r>
+    </w:p>
+    <w:p>
+      <w:pPr>
+        <w:pStyle w:val="BodyText"/>
+      </w:pPr>
+      <w:r>
+        <w:t xml:space="preserve">→</w:t>
+      </w:r>
+      <w:r>
+        <w:t xml:space="preserve"> </w:t>
+      </w:r>
+      <w:r>
+        <w:rPr>
+          <w:bCs/>
+          <w:b/>
+        </w:rPr>
+        <w:t xml:space="preserve">CAMADA 7 — Prognósticos travados por release:</w:t>
+      </w:r>
+      <w:r>
+        <w:t xml:space="preserve"> </w:t>
+      </w:r>
+      <w:r>
+        <w:t xml:space="preserve">θ*=0,333 (v1.0); regras 1-3; banda A6 (C058-C060).</w:t>
+      </w:r>
+    </w:p>
+    <w:p>
+      <w:pPr>
+        <w:pStyle w:val="BodyText"/>
+      </w:pPr>
+      <w:r>
+        <w:t xml:space="preserve">→</w:t>
+      </w:r>
+      <w:r>
+        <w:t xml:space="preserve"> </w:t>
+      </w:r>
+      <w:r>
+        <w:rPr>
+          <w:bCs/>
+          <w:b/>
+        </w:rPr>
+        <w:t xml:space="preserve">CAMADA 8 — Conclusões da tese:</w:t>
+      </w:r>
+      <w:r>
+        <w:t xml:space="preserve"> </w:t>
+      </w:r>
+      <w:r>
+        <w:t xml:space="preserve">método (etrização P0-P6) + prognóstico (θ*, regras) + dupla potencialidade (cura + restauração [C016]) + ressalva (não aplicar em humanos sem validação experimental).</w:t>
+      </w:r>
+    </w:p>
+    <w:bookmarkEnd w:id="92"/>
+    <w:bookmarkStart w:id="93" w:name="Xcf01aafabbe100b4fa70984246fa3859d33e508"/>
     <w:p>
       <w:pPr>
         <w:pStyle w:val="Heading2"/>
@@ -16028,8 +15972,8 @@
         </w:tc>
       </w:tr>
     </w:tbl>
-    <w:bookmarkEnd w:id="92"/>
-    <w:bookmarkStart w:id="93" w:name="Xdbd2d3afb06ea8b7c43e8dc5eb7e17a11a670c9"/>
+    <w:bookmarkEnd w:id="93"/>
+    <w:bookmarkStart w:id="94" w:name="Xdbd2d3afb06ea8b7c43e8dc5eb7e17a11a670c9"/>
     <w:p>
       <w:pPr>
         <w:pStyle w:val="Heading2"/>
@@ -16282,8 +16226,8 @@
         </w:tc>
       </w:tr>
     </w:tbl>
-    <w:bookmarkEnd w:id="93"/>
-    <w:bookmarkStart w:id="94" w:name="X84d99733663aa80973dd6b1a4042ae291bb8b97"/>
+    <w:bookmarkEnd w:id="94"/>
+    <w:bookmarkStart w:id="95" w:name="X84d99733663aa80973dd6b1a4042ae291bb8b97"/>
     <w:p>
       <w:pPr>
         <w:pStyle w:val="Heading2"/>
@@ -16492,7 +16436,7 @@
               <w:jc w:val="left"/>
             </w:pPr>
             <w:r>
-              <w:t xml:space="preserve">§1.7</w:t>
+              <w:t xml:space="preserve">§2.7</w:t>
             </w:r>
           </w:p>
         </w:tc>
@@ -16530,7 +16474,7 @@
               <w:jc w:val="left"/>
             </w:pPr>
             <w:r>
-              <w:t xml:space="preserve">§4.3</w:t>
+              <w:t xml:space="preserve">§6.3</w:t>
             </w:r>
           </w:p>
         </w:tc>
@@ -16606,7 +16550,7 @@
               <w:jc w:val="left"/>
             </w:pPr>
             <w:r>
-              <w:t xml:space="preserve">§5.3</w:t>
+              <w:t xml:space="preserve">§9.3</w:t>
             </w:r>
           </w:p>
         </w:tc>
@@ -16682,7 +16626,7 @@
               <w:jc w:val="left"/>
             </w:pPr>
             <w:r>
-              <w:t xml:space="preserve">§4.1</w:t>
+              <w:t xml:space="preserve">§6.1</w:t>
             </w:r>
           </w:p>
         </w:tc>
@@ -16726,8 +16670,8 @@
         </w:tc>
       </w:tr>
     </w:tbl>
-    <w:bookmarkEnd w:id="94"/>
-    <w:bookmarkStart w:id="95" w:name="b.5-prejulgando-objeções-da-banca"/>
+    <w:bookmarkEnd w:id="95"/>
+    <w:bookmarkStart w:id="96" w:name="b.5-prejulgando-objeções-da-banca"/>
     <w:p>
       <w:pPr>
         <w:pStyle w:val="Heading2"/>
@@ -16835,7 +16779,7 @@
               <w:jc w:val="left"/>
             </w:pPr>
             <w:r>
-              <w:t xml:space="preserve">Correto — e a tese DECLARA isto na Base de Validade (§3.3):</w:t>
+              <w:t xml:space="preserve">Correto — e a tese DECLARA isto na Base de Validade (§5.3):</w:t>
             </w:r>
             <w:r>
               <w:t xml:space="preserve"> </w:t>
@@ -16982,8 +16926,8 @@
         </w:pict>
       </w:r>
     </w:p>
-    <w:bookmarkEnd w:id="95"/>
-    <w:bookmarkStart w:id="96" w:name="apêndices-cf"/>
+    <w:bookmarkEnd w:id="96"/>
+    <w:bookmarkStart w:id="97" w:name="apêndices-cf"/>
     <w:p>
       <w:pPr>
         <w:pStyle w:val="Heading2"/>
@@ -17104,8 +17048,8 @@
         <w:t xml:space="preserve">Edição unificada [SEM ANO] — o resultado define; as fases são estimativas. Toda cifra vem de JSON arquivado ou do registro E (regra: nunca digitar valor). Gated: guardian R0–R3, 0 BLOCKED exigido; AST 9/9.</w:t>
       </w:r>
     </w:p>
-    <w:bookmarkEnd w:id="96"/>
     <w:bookmarkEnd w:id="97"/>
+    <w:bookmarkEnd w:id="98"/>
     <w:sectPr/>
   </w:body>
 </w:document>

</xml_diff>